<commit_message>
Finished style guide with new sections for color palette, typography, and image guidelines; enhance form and button styling for consistency.
</commit_message>
<xml_diff>
--- a/Guía de estilo.docx
+++ b/Guía de estilo.docx
@@ -87,7 +87,7 @@
                     </pic:cNvPicPr>
                   </pic:nvPicPr>
                   <pic:blipFill>
-                    <a:blip r:embed="rId5" cstate="print">
+                    <a:blip r:embed="rId6" cstate="print">
                       <a:extLst>
                         <a:ext uri="{28A0092B-C50C-407E-A947-70E740481C1C}">
                           <a14:useLocalDpi xmlns:a14="http://schemas.microsoft.com/office/drawing/2010/main" val="0"/>
@@ -181,15 +181,15 @@
           <w:szCs w:val="52"/>
         </w:rPr>
       </w:pPr>
-      <w:r>
+    </w:p>
+    <w:p>
+      <w:pPr>
         <w:rPr>
           <w:rFonts w:ascii="TT Chocolates Trl" w:hAnsi="TT Chocolates Trl"/>
           <w:sz w:val="52"/>
           <w:szCs w:val="52"/>
         </w:rPr>
-        <w:lastRenderedPageBreak/>
-        <w:t>Índice</w:t>
-      </w:r>
+      </w:pPr>
     </w:p>
     <w:p>
       <w:pPr>
@@ -199,12 +199,1099 @@
           <w:szCs w:val="52"/>
         </w:rPr>
       </w:pPr>
-      <w:r>
+    </w:p>
+    <w:p>
+      <w:pPr>
         <w:rPr>
           <w:rFonts w:ascii="TT Chocolates Trl" w:hAnsi="TT Chocolates Trl"/>
           <w:sz w:val="52"/>
           <w:szCs w:val="52"/>
         </w:rPr>
+      </w:pPr>
+    </w:p>
+    <w:p>
+      <w:pPr>
+        <w:rPr>
+          <w:rFonts w:ascii="TT Chocolates Trl" w:hAnsi="TT Chocolates Trl"/>
+          <w:sz w:val="52"/>
+          <w:szCs w:val="52"/>
+        </w:rPr>
+      </w:pPr>
+    </w:p>
+    <w:p>
+      <w:pPr>
+        <w:pStyle w:val="Cuerpo"/>
+      </w:pPr>
+    </w:p>
+    <w:p>
+      <w:pPr>
+        <w:pStyle w:val="Cuerpo"/>
+      </w:pPr>
+    </w:p>
+    <w:p>
+      <w:pPr>
+        <w:pStyle w:val="Cuerpo"/>
+      </w:pPr>
+    </w:p>
+    <w:p>
+      <w:pPr>
+        <w:pStyle w:val="Ttulos"/>
+      </w:pPr>
+      <w:r>
+        <w:t>Índice</w:t>
+      </w:r>
+    </w:p>
+    <w:p>
+      <w:pPr>
+        <w:pStyle w:val="TDC1"/>
+        <w:tabs>
+          <w:tab w:val="right" w:leader="dot" w:pos="8494"/>
+        </w:tabs>
+        <w:rPr>
+          <w:rFonts w:asciiTheme="minorHAnsi" w:hAnsiTheme="minorHAnsi" w:cstheme="minorBidi"/>
+          <w:noProof/>
+          <w:kern w:val="2"/>
+          <w:sz w:val="24"/>
+          <w:szCs w:val="24"/>
+          <w14:ligatures w14:val="standardContextual"/>
+        </w:rPr>
+      </w:pPr>
+      <w:r>
+        <w:rPr>
+          <w:sz w:val="52"/>
+          <w:szCs w:val="52"/>
+        </w:rPr>
+        <w:fldChar w:fldCharType="begin"/>
+      </w:r>
+      <w:r>
+        <w:rPr>
+          <w:sz w:val="52"/>
+          <w:szCs w:val="52"/>
+        </w:rPr>
+        <w:instrText xml:space="preserve"> TOC \h \z \t "Títulos;1;Subtítulos;2" </w:instrText>
+      </w:r>
+      <w:r>
+        <w:rPr>
+          <w:sz w:val="52"/>
+          <w:szCs w:val="52"/>
+        </w:rPr>
+        <w:fldChar w:fldCharType="separate"/>
+      </w:r>
+      <w:hyperlink w:anchor="_Toc191916011" w:history="1">
+        <w:r>
+          <w:rPr>
+            <w:rStyle w:val="Hipervnculo"/>
+            <w:noProof/>
+          </w:rPr>
+          <w:t>Paleta de colores</w:t>
+        </w:r>
+        <w:r>
+          <w:rPr>
+            <w:noProof/>
+            <w:webHidden/>
+          </w:rPr>
+          <w:tab/>
+        </w:r>
+        <w:r>
+          <w:rPr>
+            <w:noProof/>
+            <w:webHidden/>
+          </w:rPr>
+          <w:fldChar w:fldCharType="begin"/>
+        </w:r>
+        <w:r>
+          <w:rPr>
+            <w:noProof/>
+            <w:webHidden/>
+          </w:rPr>
+          <w:instrText xml:space="preserve"> PAGEREF _Toc191916011 \h </w:instrText>
+        </w:r>
+        <w:r>
+          <w:rPr>
+            <w:noProof/>
+            <w:webHidden/>
+          </w:rPr>
+        </w:r>
+        <w:r>
+          <w:rPr>
+            <w:noProof/>
+            <w:webHidden/>
+          </w:rPr>
+          <w:fldChar w:fldCharType="separate"/>
+        </w:r>
+        <w:r>
+          <w:rPr>
+            <w:noProof/>
+            <w:webHidden/>
+          </w:rPr>
+          <w:t>3</w:t>
+        </w:r>
+        <w:r>
+          <w:rPr>
+            <w:noProof/>
+            <w:webHidden/>
+          </w:rPr>
+          <w:fldChar w:fldCharType="end"/>
+        </w:r>
+      </w:hyperlink>
+    </w:p>
+    <w:p>
+      <w:pPr>
+        <w:pStyle w:val="TDC2"/>
+        <w:tabs>
+          <w:tab w:val="right" w:leader="dot" w:pos="8494"/>
+        </w:tabs>
+        <w:rPr>
+          <w:rFonts w:asciiTheme="minorHAnsi" w:hAnsiTheme="minorHAnsi" w:cstheme="minorBidi"/>
+          <w:noProof/>
+          <w:kern w:val="2"/>
+          <w:sz w:val="24"/>
+          <w:szCs w:val="24"/>
+          <w14:ligatures w14:val="standardContextual"/>
+        </w:rPr>
+      </w:pPr>
+      <w:hyperlink w:anchor="_Toc191916012" w:history="1">
+        <w:r>
+          <w:rPr>
+            <w:rStyle w:val="Hipervnculo"/>
+            <w:noProof/>
+          </w:rPr>
+          <w:t>Header</w:t>
+        </w:r>
+        <w:r>
+          <w:rPr>
+            <w:noProof/>
+            <w:webHidden/>
+          </w:rPr>
+          <w:tab/>
+        </w:r>
+        <w:r>
+          <w:rPr>
+            <w:noProof/>
+            <w:webHidden/>
+          </w:rPr>
+          <w:fldChar w:fldCharType="begin"/>
+        </w:r>
+        <w:r>
+          <w:rPr>
+            <w:noProof/>
+            <w:webHidden/>
+          </w:rPr>
+          <w:instrText xml:space="preserve"> PAGEREF _Toc191916012 \h </w:instrText>
+        </w:r>
+        <w:r>
+          <w:rPr>
+            <w:noProof/>
+            <w:webHidden/>
+          </w:rPr>
+        </w:r>
+        <w:r>
+          <w:rPr>
+            <w:noProof/>
+            <w:webHidden/>
+          </w:rPr>
+          <w:fldChar w:fldCharType="separate"/>
+        </w:r>
+        <w:r>
+          <w:rPr>
+            <w:noProof/>
+            <w:webHidden/>
+          </w:rPr>
+          <w:t>4</w:t>
+        </w:r>
+        <w:r>
+          <w:rPr>
+            <w:noProof/>
+            <w:webHidden/>
+          </w:rPr>
+          <w:fldChar w:fldCharType="end"/>
+        </w:r>
+      </w:hyperlink>
+    </w:p>
+    <w:p>
+      <w:pPr>
+        <w:pStyle w:val="TDC2"/>
+        <w:tabs>
+          <w:tab w:val="right" w:leader="dot" w:pos="8494"/>
+        </w:tabs>
+        <w:rPr>
+          <w:rFonts w:asciiTheme="minorHAnsi" w:hAnsiTheme="minorHAnsi" w:cstheme="minorBidi"/>
+          <w:noProof/>
+          <w:kern w:val="2"/>
+          <w:sz w:val="24"/>
+          <w:szCs w:val="24"/>
+          <w14:ligatures w14:val="standardContextual"/>
+        </w:rPr>
+      </w:pPr>
+      <w:hyperlink w:anchor="_Toc191916013" w:history="1">
+        <w:r>
+          <w:rPr>
+            <w:rStyle w:val="Hipervnculo"/>
+            <w:noProof/>
+          </w:rPr>
+          <w:t>Texto</w:t>
+        </w:r>
+        <w:r>
+          <w:rPr>
+            <w:noProof/>
+            <w:webHidden/>
+          </w:rPr>
+          <w:tab/>
+        </w:r>
+        <w:r>
+          <w:rPr>
+            <w:noProof/>
+            <w:webHidden/>
+          </w:rPr>
+          <w:fldChar w:fldCharType="begin"/>
+        </w:r>
+        <w:r>
+          <w:rPr>
+            <w:noProof/>
+            <w:webHidden/>
+          </w:rPr>
+          <w:instrText xml:space="preserve"> PAGEREF _Toc191916013 \h </w:instrText>
+        </w:r>
+        <w:r>
+          <w:rPr>
+            <w:noProof/>
+            <w:webHidden/>
+          </w:rPr>
+        </w:r>
+        <w:r>
+          <w:rPr>
+            <w:noProof/>
+            <w:webHidden/>
+          </w:rPr>
+          <w:fldChar w:fldCharType="separate"/>
+        </w:r>
+        <w:r>
+          <w:rPr>
+            <w:noProof/>
+            <w:webHidden/>
+          </w:rPr>
+          <w:t>4</w:t>
+        </w:r>
+        <w:r>
+          <w:rPr>
+            <w:noProof/>
+            <w:webHidden/>
+          </w:rPr>
+          <w:fldChar w:fldCharType="end"/>
+        </w:r>
+      </w:hyperlink>
+    </w:p>
+    <w:p>
+      <w:pPr>
+        <w:pStyle w:val="TDC2"/>
+        <w:tabs>
+          <w:tab w:val="right" w:leader="dot" w:pos="8494"/>
+        </w:tabs>
+        <w:rPr>
+          <w:rFonts w:asciiTheme="minorHAnsi" w:hAnsiTheme="minorHAnsi" w:cstheme="minorBidi"/>
+          <w:noProof/>
+          <w:kern w:val="2"/>
+          <w:sz w:val="24"/>
+          <w:szCs w:val="24"/>
+          <w14:ligatures w14:val="standardContextual"/>
+        </w:rPr>
+      </w:pPr>
+      <w:hyperlink w:anchor="_Toc191916014" w:history="1">
+        <w:r>
+          <w:rPr>
+            <w:rStyle w:val="Hipervnculo"/>
+            <w:noProof/>
+          </w:rPr>
+          <w:t>Botones</w:t>
+        </w:r>
+        <w:r>
+          <w:rPr>
+            <w:noProof/>
+            <w:webHidden/>
+          </w:rPr>
+          <w:tab/>
+        </w:r>
+        <w:r>
+          <w:rPr>
+            <w:noProof/>
+            <w:webHidden/>
+          </w:rPr>
+          <w:fldChar w:fldCharType="begin"/>
+        </w:r>
+        <w:r>
+          <w:rPr>
+            <w:noProof/>
+            <w:webHidden/>
+          </w:rPr>
+          <w:instrText xml:space="preserve"> PAGEREF _Toc191916014 \h </w:instrText>
+        </w:r>
+        <w:r>
+          <w:rPr>
+            <w:noProof/>
+            <w:webHidden/>
+          </w:rPr>
+        </w:r>
+        <w:r>
+          <w:rPr>
+            <w:noProof/>
+            <w:webHidden/>
+          </w:rPr>
+          <w:fldChar w:fldCharType="separate"/>
+        </w:r>
+        <w:r>
+          <w:rPr>
+            <w:noProof/>
+            <w:webHidden/>
+          </w:rPr>
+          <w:t>4</w:t>
+        </w:r>
+        <w:r>
+          <w:rPr>
+            <w:noProof/>
+            <w:webHidden/>
+          </w:rPr>
+          <w:fldChar w:fldCharType="end"/>
+        </w:r>
+      </w:hyperlink>
+    </w:p>
+    <w:p>
+      <w:pPr>
+        <w:pStyle w:val="TDC2"/>
+        <w:tabs>
+          <w:tab w:val="right" w:leader="dot" w:pos="8494"/>
+        </w:tabs>
+        <w:rPr>
+          <w:rFonts w:asciiTheme="minorHAnsi" w:hAnsiTheme="minorHAnsi" w:cstheme="minorBidi"/>
+          <w:noProof/>
+          <w:kern w:val="2"/>
+          <w:sz w:val="24"/>
+          <w:szCs w:val="24"/>
+          <w14:ligatures w14:val="standardContextual"/>
+        </w:rPr>
+      </w:pPr>
+      <w:hyperlink w:anchor="_Toc191916015" w:history="1">
+        <w:r>
+          <w:rPr>
+            <w:rStyle w:val="Hipervnculo"/>
+            <w:noProof/>
+          </w:rPr>
+          <w:t>Enlaces</w:t>
+        </w:r>
+        <w:r>
+          <w:rPr>
+            <w:noProof/>
+            <w:webHidden/>
+          </w:rPr>
+          <w:tab/>
+        </w:r>
+        <w:r>
+          <w:rPr>
+            <w:noProof/>
+            <w:webHidden/>
+          </w:rPr>
+          <w:fldChar w:fldCharType="begin"/>
+        </w:r>
+        <w:r>
+          <w:rPr>
+            <w:noProof/>
+            <w:webHidden/>
+          </w:rPr>
+          <w:instrText xml:space="preserve"> PAGEREF _Toc191916015 \h </w:instrText>
+        </w:r>
+        <w:r>
+          <w:rPr>
+            <w:noProof/>
+            <w:webHidden/>
+          </w:rPr>
+        </w:r>
+        <w:r>
+          <w:rPr>
+            <w:noProof/>
+            <w:webHidden/>
+          </w:rPr>
+          <w:fldChar w:fldCharType="separate"/>
+        </w:r>
+        <w:r>
+          <w:rPr>
+            <w:noProof/>
+            <w:webHidden/>
+          </w:rPr>
+          <w:t>5</w:t>
+        </w:r>
+        <w:r>
+          <w:rPr>
+            <w:noProof/>
+            <w:webHidden/>
+          </w:rPr>
+          <w:fldChar w:fldCharType="end"/>
+        </w:r>
+      </w:hyperlink>
+    </w:p>
+    <w:p>
+      <w:pPr>
+        <w:pStyle w:val="TDC2"/>
+        <w:tabs>
+          <w:tab w:val="right" w:leader="dot" w:pos="8494"/>
+        </w:tabs>
+        <w:rPr>
+          <w:rFonts w:asciiTheme="minorHAnsi" w:hAnsiTheme="minorHAnsi" w:cstheme="minorBidi"/>
+          <w:noProof/>
+          <w:kern w:val="2"/>
+          <w:sz w:val="24"/>
+          <w:szCs w:val="24"/>
+          <w14:ligatures w14:val="standardContextual"/>
+        </w:rPr>
+      </w:pPr>
+      <w:hyperlink w:anchor="_Toc191916016" w:history="1">
+        <w:r>
+          <w:rPr>
+            <w:rStyle w:val="Hipervnculo"/>
+            <w:noProof/>
+          </w:rPr>
+          <w:t>Footer</w:t>
+        </w:r>
+        <w:r>
+          <w:rPr>
+            <w:noProof/>
+            <w:webHidden/>
+          </w:rPr>
+          <w:tab/>
+        </w:r>
+        <w:r>
+          <w:rPr>
+            <w:noProof/>
+            <w:webHidden/>
+          </w:rPr>
+          <w:fldChar w:fldCharType="begin"/>
+        </w:r>
+        <w:r>
+          <w:rPr>
+            <w:noProof/>
+            <w:webHidden/>
+          </w:rPr>
+          <w:instrText xml:space="preserve"> PAGEREF _Toc191916016 \h </w:instrText>
+        </w:r>
+        <w:r>
+          <w:rPr>
+            <w:noProof/>
+            <w:webHidden/>
+          </w:rPr>
+        </w:r>
+        <w:r>
+          <w:rPr>
+            <w:noProof/>
+            <w:webHidden/>
+          </w:rPr>
+          <w:fldChar w:fldCharType="separate"/>
+        </w:r>
+        <w:r>
+          <w:rPr>
+            <w:noProof/>
+            <w:webHidden/>
+          </w:rPr>
+          <w:t>5</w:t>
+        </w:r>
+        <w:r>
+          <w:rPr>
+            <w:noProof/>
+            <w:webHidden/>
+          </w:rPr>
+          <w:fldChar w:fldCharType="end"/>
+        </w:r>
+      </w:hyperlink>
+    </w:p>
+    <w:p>
+      <w:pPr>
+        <w:pStyle w:val="TDC1"/>
+        <w:tabs>
+          <w:tab w:val="right" w:leader="dot" w:pos="8494"/>
+        </w:tabs>
+        <w:rPr>
+          <w:rFonts w:asciiTheme="minorHAnsi" w:hAnsiTheme="minorHAnsi" w:cstheme="minorBidi"/>
+          <w:noProof/>
+          <w:kern w:val="2"/>
+          <w:sz w:val="24"/>
+          <w:szCs w:val="24"/>
+          <w14:ligatures w14:val="standardContextual"/>
+        </w:rPr>
+      </w:pPr>
+      <w:hyperlink w:anchor="_Toc191916017" w:history="1">
+        <w:r>
+          <w:rPr>
+            <w:rStyle w:val="Hipervnculo"/>
+            <w:noProof/>
+          </w:rPr>
+          <w:t>Tipografías</w:t>
+        </w:r>
+        <w:r>
+          <w:rPr>
+            <w:noProof/>
+            <w:webHidden/>
+          </w:rPr>
+          <w:tab/>
+        </w:r>
+        <w:r>
+          <w:rPr>
+            <w:noProof/>
+            <w:webHidden/>
+          </w:rPr>
+          <w:fldChar w:fldCharType="begin"/>
+        </w:r>
+        <w:r>
+          <w:rPr>
+            <w:noProof/>
+            <w:webHidden/>
+          </w:rPr>
+          <w:instrText xml:space="preserve"> PAGEREF _Toc191916017 \h </w:instrText>
+        </w:r>
+        <w:r>
+          <w:rPr>
+            <w:noProof/>
+            <w:webHidden/>
+          </w:rPr>
+        </w:r>
+        <w:r>
+          <w:rPr>
+            <w:noProof/>
+            <w:webHidden/>
+          </w:rPr>
+          <w:fldChar w:fldCharType="separate"/>
+        </w:r>
+        <w:r>
+          <w:rPr>
+            <w:noProof/>
+            <w:webHidden/>
+          </w:rPr>
+          <w:t>6</w:t>
+        </w:r>
+        <w:r>
+          <w:rPr>
+            <w:noProof/>
+            <w:webHidden/>
+          </w:rPr>
+          <w:fldChar w:fldCharType="end"/>
+        </w:r>
+      </w:hyperlink>
+    </w:p>
+    <w:p>
+      <w:pPr>
+        <w:pStyle w:val="TDC2"/>
+        <w:tabs>
+          <w:tab w:val="right" w:leader="dot" w:pos="8494"/>
+        </w:tabs>
+        <w:rPr>
+          <w:rFonts w:asciiTheme="minorHAnsi" w:hAnsiTheme="minorHAnsi" w:cstheme="minorBidi"/>
+          <w:noProof/>
+          <w:kern w:val="2"/>
+          <w:sz w:val="24"/>
+          <w:szCs w:val="24"/>
+          <w14:ligatures w14:val="standardContextual"/>
+        </w:rPr>
+      </w:pPr>
+      <w:hyperlink w:anchor="_Toc191916018" w:history="1">
+        <w:r>
+          <w:rPr>
+            <w:rStyle w:val="Hipervnculo"/>
+            <w:noProof/>
+          </w:rPr>
+          <w:t>Fanlste</w:t>
+        </w:r>
+        <w:r>
+          <w:rPr>
+            <w:noProof/>
+            <w:webHidden/>
+          </w:rPr>
+          <w:tab/>
+        </w:r>
+        <w:r>
+          <w:rPr>
+            <w:noProof/>
+            <w:webHidden/>
+          </w:rPr>
+          <w:fldChar w:fldCharType="begin"/>
+        </w:r>
+        <w:r>
+          <w:rPr>
+            <w:noProof/>
+            <w:webHidden/>
+          </w:rPr>
+          <w:instrText xml:space="preserve"> PAGEREF _Toc191916018 \h </w:instrText>
+        </w:r>
+        <w:r>
+          <w:rPr>
+            <w:noProof/>
+            <w:webHidden/>
+          </w:rPr>
+        </w:r>
+        <w:r>
+          <w:rPr>
+            <w:noProof/>
+            <w:webHidden/>
+          </w:rPr>
+          <w:fldChar w:fldCharType="separate"/>
+        </w:r>
+        <w:r>
+          <w:rPr>
+            <w:noProof/>
+            <w:webHidden/>
+          </w:rPr>
+          <w:t>7</w:t>
+        </w:r>
+        <w:r>
+          <w:rPr>
+            <w:noProof/>
+            <w:webHidden/>
+          </w:rPr>
+          <w:fldChar w:fldCharType="end"/>
+        </w:r>
+      </w:hyperlink>
+    </w:p>
+    <w:p>
+      <w:pPr>
+        <w:pStyle w:val="TDC2"/>
+        <w:tabs>
+          <w:tab w:val="right" w:leader="dot" w:pos="8494"/>
+        </w:tabs>
+        <w:rPr>
+          <w:rFonts w:asciiTheme="minorHAnsi" w:hAnsiTheme="minorHAnsi" w:cstheme="minorBidi"/>
+          <w:noProof/>
+          <w:kern w:val="2"/>
+          <w:sz w:val="24"/>
+          <w:szCs w:val="24"/>
+          <w14:ligatures w14:val="standardContextual"/>
+        </w:rPr>
+      </w:pPr>
+      <w:hyperlink w:anchor="_Toc191916019" w:history="1">
+        <w:r>
+          <w:rPr>
+            <w:rStyle w:val="Hipervnculo"/>
+            <w:noProof/>
+          </w:rPr>
+          <w:t>Chocolates</w:t>
+        </w:r>
+        <w:r>
+          <w:rPr>
+            <w:noProof/>
+            <w:webHidden/>
+          </w:rPr>
+          <w:tab/>
+        </w:r>
+        <w:r>
+          <w:rPr>
+            <w:noProof/>
+            <w:webHidden/>
+          </w:rPr>
+          <w:fldChar w:fldCharType="begin"/>
+        </w:r>
+        <w:r>
+          <w:rPr>
+            <w:noProof/>
+            <w:webHidden/>
+          </w:rPr>
+          <w:instrText xml:space="preserve"> PAGEREF _Toc191916019 \h </w:instrText>
+        </w:r>
+        <w:r>
+          <w:rPr>
+            <w:noProof/>
+            <w:webHidden/>
+          </w:rPr>
+        </w:r>
+        <w:r>
+          <w:rPr>
+            <w:noProof/>
+            <w:webHidden/>
+          </w:rPr>
+          <w:fldChar w:fldCharType="separate"/>
+        </w:r>
+        <w:r>
+          <w:rPr>
+            <w:noProof/>
+            <w:webHidden/>
+          </w:rPr>
+          <w:t>7</w:t>
+        </w:r>
+        <w:r>
+          <w:rPr>
+            <w:noProof/>
+            <w:webHidden/>
+          </w:rPr>
+          <w:fldChar w:fldCharType="end"/>
+        </w:r>
+      </w:hyperlink>
+    </w:p>
+    <w:p>
+      <w:pPr>
+        <w:pStyle w:val="TDC2"/>
+        <w:tabs>
+          <w:tab w:val="right" w:leader="dot" w:pos="8494"/>
+        </w:tabs>
+        <w:rPr>
+          <w:rFonts w:asciiTheme="minorHAnsi" w:hAnsiTheme="minorHAnsi" w:cstheme="minorBidi"/>
+          <w:noProof/>
+          <w:kern w:val="2"/>
+          <w:sz w:val="24"/>
+          <w:szCs w:val="24"/>
+          <w14:ligatures w14:val="standardContextual"/>
+        </w:rPr>
+      </w:pPr>
+      <w:hyperlink w:anchor="_Toc191916020" w:history="1">
+        <w:r>
+          <w:rPr>
+            <w:rStyle w:val="Hipervnculo"/>
+            <w:noProof/>
+          </w:rPr>
+          <w:t>Apollo</w:t>
+        </w:r>
+        <w:r>
+          <w:rPr>
+            <w:noProof/>
+            <w:webHidden/>
+          </w:rPr>
+          <w:tab/>
+        </w:r>
+        <w:r>
+          <w:rPr>
+            <w:noProof/>
+            <w:webHidden/>
+          </w:rPr>
+          <w:fldChar w:fldCharType="begin"/>
+        </w:r>
+        <w:r>
+          <w:rPr>
+            <w:noProof/>
+            <w:webHidden/>
+          </w:rPr>
+          <w:instrText xml:space="preserve"> PAGEREF _Toc191916020 \h </w:instrText>
+        </w:r>
+        <w:r>
+          <w:rPr>
+            <w:noProof/>
+            <w:webHidden/>
+          </w:rPr>
+        </w:r>
+        <w:r>
+          <w:rPr>
+            <w:noProof/>
+            <w:webHidden/>
+          </w:rPr>
+          <w:fldChar w:fldCharType="separate"/>
+        </w:r>
+        <w:r>
+          <w:rPr>
+            <w:noProof/>
+            <w:webHidden/>
+          </w:rPr>
+          <w:t>8</w:t>
+        </w:r>
+        <w:r>
+          <w:rPr>
+            <w:noProof/>
+            <w:webHidden/>
+          </w:rPr>
+          <w:fldChar w:fldCharType="end"/>
+        </w:r>
+      </w:hyperlink>
+    </w:p>
+    <w:p>
+      <w:pPr>
+        <w:pStyle w:val="TDC1"/>
+        <w:tabs>
+          <w:tab w:val="right" w:leader="dot" w:pos="8494"/>
+        </w:tabs>
+        <w:rPr>
+          <w:rFonts w:asciiTheme="minorHAnsi" w:hAnsiTheme="minorHAnsi" w:cstheme="minorBidi"/>
+          <w:noProof/>
+          <w:kern w:val="2"/>
+          <w:sz w:val="24"/>
+          <w:szCs w:val="24"/>
+          <w14:ligatures w14:val="standardContextual"/>
+        </w:rPr>
+      </w:pPr>
+      <w:hyperlink w:anchor="_Toc191916021" w:history="1">
+        <w:r>
+          <w:rPr>
+            <w:rStyle w:val="Hipervnculo"/>
+            <w:noProof/>
+          </w:rPr>
+          <w:t>Elementos de navegación</w:t>
+        </w:r>
+        <w:r>
+          <w:rPr>
+            <w:noProof/>
+            <w:webHidden/>
+          </w:rPr>
+          <w:tab/>
+        </w:r>
+        <w:r>
+          <w:rPr>
+            <w:noProof/>
+            <w:webHidden/>
+          </w:rPr>
+          <w:fldChar w:fldCharType="begin"/>
+        </w:r>
+        <w:r>
+          <w:rPr>
+            <w:noProof/>
+            <w:webHidden/>
+          </w:rPr>
+          <w:instrText xml:space="preserve"> PAGEREF _Toc191916021 \h </w:instrText>
+        </w:r>
+        <w:r>
+          <w:rPr>
+            <w:noProof/>
+            <w:webHidden/>
+          </w:rPr>
+        </w:r>
+        <w:r>
+          <w:rPr>
+            <w:noProof/>
+            <w:webHidden/>
+          </w:rPr>
+          <w:fldChar w:fldCharType="separate"/>
+        </w:r>
+        <w:r>
+          <w:rPr>
+            <w:noProof/>
+            <w:webHidden/>
+          </w:rPr>
+          <w:t>9</w:t>
+        </w:r>
+        <w:r>
+          <w:rPr>
+            <w:noProof/>
+            <w:webHidden/>
+          </w:rPr>
+          <w:fldChar w:fldCharType="end"/>
+        </w:r>
+      </w:hyperlink>
+    </w:p>
+    <w:p>
+      <w:pPr>
+        <w:pStyle w:val="TDC2"/>
+        <w:tabs>
+          <w:tab w:val="right" w:leader="dot" w:pos="8494"/>
+        </w:tabs>
+        <w:rPr>
+          <w:rFonts w:asciiTheme="minorHAnsi" w:hAnsiTheme="minorHAnsi" w:cstheme="minorBidi"/>
+          <w:noProof/>
+          <w:kern w:val="2"/>
+          <w:sz w:val="24"/>
+          <w:szCs w:val="24"/>
+          <w14:ligatures w14:val="standardContextual"/>
+        </w:rPr>
+      </w:pPr>
+      <w:hyperlink w:anchor="_Toc191916022" w:history="1">
+        <w:r>
+          <w:rPr>
+            <w:rStyle w:val="Hipervnculo"/>
+            <w:noProof/>
+          </w:rPr>
+          <w:t>Formularios</w:t>
+        </w:r>
+        <w:r>
+          <w:rPr>
+            <w:noProof/>
+            <w:webHidden/>
+          </w:rPr>
+          <w:tab/>
+        </w:r>
+        <w:r>
+          <w:rPr>
+            <w:noProof/>
+            <w:webHidden/>
+          </w:rPr>
+          <w:fldChar w:fldCharType="begin"/>
+        </w:r>
+        <w:r>
+          <w:rPr>
+            <w:noProof/>
+            <w:webHidden/>
+          </w:rPr>
+          <w:instrText xml:space="preserve"> PAGEREF _Toc191916022 \h </w:instrText>
+        </w:r>
+        <w:r>
+          <w:rPr>
+            <w:noProof/>
+            <w:webHidden/>
+          </w:rPr>
+        </w:r>
+        <w:r>
+          <w:rPr>
+            <w:noProof/>
+            <w:webHidden/>
+          </w:rPr>
+          <w:fldChar w:fldCharType="separate"/>
+        </w:r>
+        <w:r>
+          <w:rPr>
+            <w:noProof/>
+            <w:webHidden/>
+          </w:rPr>
+          <w:t>9</w:t>
+        </w:r>
+        <w:r>
+          <w:rPr>
+            <w:noProof/>
+            <w:webHidden/>
+          </w:rPr>
+          <w:fldChar w:fldCharType="end"/>
+        </w:r>
+      </w:hyperlink>
+    </w:p>
+    <w:p>
+      <w:pPr>
+        <w:pStyle w:val="TDC2"/>
+        <w:tabs>
+          <w:tab w:val="right" w:leader="dot" w:pos="8494"/>
+        </w:tabs>
+        <w:rPr>
+          <w:rFonts w:asciiTheme="minorHAnsi" w:hAnsiTheme="minorHAnsi" w:cstheme="minorBidi"/>
+          <w:noProof/>
+          <w:kern w:val="2"/>
+          <w:sz w:val="24"/>
+          <w:szCs w:val="24"/>
+          <w14:ligatures w14:val="standardContextual"/>
+        </w:rPr>
+      </w:pPr>
+      <w:hyperlink w:anchor="_Toc191916023" w:history="1">
+        <w:r>
+          <w:rPr>
+            <w:rStyle w:val="Hipervnculo"/>
+            <w:noProof/>
+          </w:rPr>
+          <w:t>Botones</w:t>
+        </w:r>
+        <w:r>
+          <w:rPr>
+            <w:noProof/>
+            <w:webHidden/>
+          </w:rPr>
+          <w:tab/>
+        </w:r>
+        <w:r>
+          <w:rPr>
+            <w:noProof/>
+            <w:webHidden/>
+          </w:rPr>
+          <w:fldChar w:fldCharType="begin"/>
+        </w:r>
+        <w:r>
+          <w:rPr>
+            <w:noProof/>
+            <w:webHidden/>
+          </w:rPr>
+          <w:instrText xml:space="preserve"> PAGEREF _Toc191916023 \h </w:instrText>
+        </w:r>
+        <w:r>
+          <w:rPr>
+            <w:noProof/>
+            <w:webHidden/>
+          </w:rPr>
+        </w:r>
+        <w:r>
+          <w:rPr>
+            <w:noProof/>
+            <w:webHidden/>
+          </w:rPr>
+          <w:fldChar w:fldCharType="separate"/>
+        </w:r>
+        <w:r>
+          <w:rPr>
+            <w:noProof/>
+            <w:webHidden/>
+          </w:rPr>
+          <w:t>9</w:t>
+        </w:r>
+        <w:r>
+          <w:rPr>
+            <w:noProof/>
+            <w:webHidden/>
+          </w:rPr>
+          <w:fldChar w:fldCharType="end"/>
+        </w:r>
+      </w:hyperlink>
+    </w:p>
+    <w:p>
+      <w:pPr>
+        <w:pStyle w:val="TDC2"/>
+        <w:tabs>
+          <w:tab w:val="right" w:leader="dot" w:pos="8494"/>
+        </w:tabs>
+        <w:rPr>
+          <w:rFonts w:asciiTheme="minorHAnsi" w:hAnsiTheme="minorHAnsi" w:cstheme="minorBidi"/>
+          <w:noProof/>
+          <w:kern w:val="2"/>
+          <w:sz w:val="24"/>
+          <w:szCs w:val="24"/>
+          <w14:ligatures w14:val="standardContextual"/>
+        </w:rPr>
+      </w:pPr>
+      <w:hyperlink w:anchor="_Toc191916024" w:history="1">
+        <w:r>
+          <w:rPr>
+            <w:rStyle w:val="Hipervnculo"/>
+            <w:noProof/>
+          </w:rPr>
+          <w:t>Imágenes</w:t>
+        </w:r>
+        <w:r>
+          <w:rPr>
+            <w:noProof/>
+            <w:webHidden/>
+          </w:rPr>
+          <w:tab/>
+        </w:r>
+        <w:r>
+          <w:rPr>
+            <w:noProof/>
+            <w:webHidden/>
+          </w:rPr>
+          <w:fldChar w:fldCharType="begin"/>
+        </w:r>
+        <w:r>
+          <w:rPr>
+            <w:noProof/>
+            <w:webHidden/>
+          </w:rPr>
+          <w:instrText xml:space="preserve"> PAGEREF _Toc191916024 \h </w:instrText>
+        </w:r>
+        <w:r>
+          <w:rPr>
+            <w:noProof/>
+            <w:webHidden/>
+          </w:rPr>
+        </w:r>
+        <w:r>
+          <w:rPr>
+            <w:noProof/>
+            <w:webHidden/>
+          </w:rPr>
+          <w:fldChar w:fldCharType="separate"/>
+        </w:r>
+        <w:r>
+          <w:rPr>
+            <w:noProof/>
+            <w:webHidden/>
+          </w:rPr>
+          <w:t>10</w:t>
+        </w:r>
+        <w:r>
+          <w:rPr>
+            <w:noProof/>
+            <w:webHidden/>
+          </w:rPr>
+          <w:fldChar w:fldCharType="end"/>
+        </w:r>
+      </w:hyperlink>
+    </w:p>
+    <w:p>
+      <w:r>
+        <w:rPr>
+          <w:lang w:eastAsia="es-ES"/>
+        </w:rPr>
+        <w:fldChar w:fldCharType="end"/>
+      </w:r>
+      <w:r>
         <w:br w:type="page"/>
       </w:r>
     </w:p>
@@ -212,10 +1299,15 @@
       <w:pPr>
         <w:pStyle w:val="Ttulos"/>
       </w:pPr>
+      <w:bookmarkStart w:id="0" w:name="_Toc191916011"/>
       <w:r>
         <w:lastRenderedPageBreak/>
-        <w:t>Paleta de colores</w:t>
-      </w:r>
+        <w:t xml:space="preserve">Paleta de </w:t>
+      </w:r>
+      <w:r>
+        <w:t>colores</w:t>
+      </w:r>
+      <w:bookmarkEnd w:id="0"/>
     </w:p>
     <w:p>
       <w:pPr>
@@ -259,7 +1351,7 @@
                     <pic:cNvPicPr/>
                   </pic:nvPicPr>
                   <pic:blipFill>
-                    <a:blip r:embed="rId6">
+                    <a:blip r:embed="rId7">
                       <a:extLst>
                         <a:ext uri="{28A0092B-C50C-407E-A947-70E740481C1C}">
                           <a14:useLocalDpi xmlns:a14="http://schemas.microsoft.com/office/drawing/2010/main" val="0"/>
@@ -332,7 +1424,7 @@
                     <pic:cNvPicPr/>
                   </pic:nvPicPr>
                   <pic:blipFill>
-                    <a:blip r:embed="rId7">
+                    <a:blip r:embed="rId8">
                       <a:extLst>
                         <a:ext uri="{28A0092B-C50C-407E-A947-70E740481C1C}">
                           <a14:useLocalDpi xmlns:a14="http://schemas.microsoft.com/office/drawing/2010/main" val="0"/>
@@ -377,10 +1469,12 @@
       <w:pPr>
         <w:pStyle w:val="Subttulos"/>
       </w:pPr>
+      <w:bookmarkStart w:id="1" w:name="_Toc191916012"/>
       <w:r>
         <w:lastRenderedPageBreak/>
         <w:t>Header</w:t>
       </w:r>
+      <w:bookmarkEnd w:id="1"/>
     </w:p>
     <w:p>
       <w:pPr>
@@ -399,7 +1493,7 @@
           <w:noProof/>
         </w:rPr>
         <w:drawing>
-          <wp:inline distT="0" distB="0" distL="0" distR="0" wp14:anchorId="7636D696" wp14:editId="03D46CFB">
+          <wp:inline distT="0" distB="0" distL="0" distR="0" wp14:anchorId="7636D696" wp14:editId="612D19BA">
             <wp:extent cx="5400040" cy="365125"/>
             <wp:effectExtent l="0" t="0" r="0" b="0"/>
             <wp:docPr id="1852604078" name="Imagen 1"/>
@@ -414,7 +1508,7 @@
                     <pic:cNvPicPr/>
                   </pic:nvPicPr>
                   <pic:blipFill>
-                    <a:blip r:embed="rId8"/>
+                    <a:blip r:embed="rId9"/>
                     <a:stretch>
                       <a:fillRect/>
                     </a:stretch>
@@ -457,9 +1551,11 @@
       <w:pPr>
         <w:pStyle w:val="Subttulos"/>
       </w:pPr>
+      <w:bookmarkStart w:id="2" w:name="_Toc191916013"/>
       <w:r>
         <w:t>Texto</w:t>
       </w:r>
+      <w:bookmarkEnd w:id="2"/>
     </w:p>
     <w:p>
       <w:pPr>
@@ -470,7 +1566,7 @@
           <w:noProof/>
         </w:rPr>
         <w:drawing>
-          <wp:anchor distT="0" distB="0" distL="114300" distR="114300" simplePos="0" relativeHeight="251661312" behindDoc="0" locked="0" layoutInCell="1" allowOverlap="1" wp14:anchorId="3AC8585A" wp14:editId="0A82C428">
+          <wp:anchor distT="0" distB="0" distL="114300" distR="114300" simplePos="0" relativeHeight="251661312" behindDoc="0" locked="0" layoutInCell="1" allowOverlap="1" wp14:anchorId="3AC8585A" wp14:editId="0F8030CE">
             <wp:simplePos x="0" y="0"/>
             <wp:positionH relativeFrom="margin">
               <wp:align>center</wp:align>
@@ -493,7 +1589,7 @@
                     <pic:cNvPicPr/>
                   </pic:nvPicPr>
                   <pic:blipFill rotWithShape="1">
-                    <a:blip r:embed="rId9">
+                    <a:blip r:embed="rId10">
                       <a:extLst>
                         <a:ext uri="{28A0092B-C50C-407E-A947-70E740481C1C}">
                           <a14:useLocalDpi xmlns:a14="http://schemas.microsoft.com/office/drawing/2010/main" val="0"/>
@@ -558,31 +1654,30 @@
       <w:pPr>
         <w:pStyle w:val="Subttulos"/>
       </w:pPr>
+      <w:bookmarkStart w:id="3" w:name="_Toc191916014"/>
       <w:r>
         <w:t>Botones</w:t>
       </w:r>
-    </w:p>
-    <w:p>
-      <w:pPr>
-        <w:pStyle w:val="Cuerpo"/>
-      </w:pPr>
-      <w:r>
-        <w:rPr>
-          <w:noProof/>
-        </w:rPr>
+      <w:bookmarkEnd w:id="3"/>
+    </w:p>
+    <w:p>
+      <w:pPr>
+        <w:pStyle w:val="Cuerpo"/>
+      </w:pPr>
+      <w:r>
         <w:drawing>
-          <wp:anchor distT="0" distB="0" distL="114300" distR="114300" simplePos="0" relativeHeight="251663360" behindDoc="0" locked="0" layoutInCell="1" allowOverlap="1" wp14:anchorId="2C47BBBE" wp14:editId="785A735D">
+          <wp:anchor distT="0" distB="0" distL="114300" distR="114300" simplePos="0" relativeHeight="251674624" behindDoc="0" locked="0" layoutInCell="1" allowOverlap="1" wp14:anchorId="0B91EBCD" wp14:editId="085611B8">
             <wp:simplePos x="0" y="0"/>
             <wp:positionH relativeFrom="column">
-              <wp:posOffset>2577465</wp:posOffset>
+              <wp:posOffset>2625090</wp:posOffset>
             </wp:positionH>
             <wp:positionV relativeFrom="paragraph">
-              <wp:posOffset>573405</wp:posOffset>
+              <wp:posOffset>605790</wp:posOffset>
             </wp:positionV>
-            <wp:extent cx="1802130" cy="600075"/>
-            <wp:effectExtent l="0" t="0" r="7620" b="9525"/>
+            <wp:extent cx="1581150" cy="571500"/>
+            <wp:effectExtent l="0" t="0" r="0" b="0"/>
             <wp:wrapSquare wrapText="bothSides"/>
-            <wp:docPr id="1708575182" name="Imagen 1"/>
+            <wp:docPr id="2030322790" name="Imagen 1"/>
             <wp:cNvGraphicFramePr>
               <a:graphicFrameLocks xmlns:a="http://schemas.openxmlformats.org/drawingml/2006/main" noChangeAspect="1"/>
             </wp:cNvGraphicFramePr>
@@ -590,36 +1685,29 @@
               <a:graphicData uri="http://schemas.openxmlformats.org/drawingml/2006/picture">
                 <pic:pic xmlns:pic="http://schemas.openxmlformats.org/drawingml/2006/picture">
                   <pic:nvPicPr>
-                    <pic:cNvPr id="1708575182" name=""/>
+                    <pic:cNvPr id="2030322790" name=""/>
                     <pic:cNvPicPr/>
                   </pic:nvPicPr>
-                  <pic:blipFill rotWithShape="1">
-                    <a:blip r:embed="rId10">
+                  <pic:blipFill>
+                    <a:blip r:embed="rId11">
                       <a:extLst>
                         <a:ext uri="{28A0092B-C50C-407E-A947-70E740481C1C}">
                           <a14:useLocalDpi xmlns:a14="http://schemas.microsoft.com/office/drawing/2010/main" val="0"/>
                         </a:ext>
                       </a:extLst>
                     </a:blip>
-                    <a:srcRect b="3077"/>
-                    <a:stretch/>
+                    <a:stretch>
+                      <a:fillRect/>
+                    </a:stretch>
                   </pic:blipFill>
-                  <pic:spPr bwMode="auto">
+                  <pic:spPr>
                     <a:xfrm>
                       <a:off x="0" y="0"/>
-                      <a:ext cx="1802130" cy="600075"/>
+                      <a:ext cx="1581150" cy="571500"/>
                     </a:xfrm>
                     <a:prstGeom prst="rect">
                       <a:avLst/>
                     </a:prstGeom>
-                    <a:ln>
-                      <a:noFill/>
-                    </a:ln>
-                    <a:extLst>
-                      <a:ext uri="{53640926-AAD7-44D8-BBD7-CCE9431645EC}">
-                        <a14:shadowObscured xmlns:a14="http://schemas.microsoft.com/office/drawing/2010/main"/>
-                      </a:ext>
-                    </a:extLst>
                   </pic:spPr>
                 </pic:pic>
               </a:graphicData>
@@ -634,22 +1722,27 @@
         </w:drawing>
       </w:r>
       <w:r>
-        <w:rPr>
-          <w:noProof/>
-        </w:rPr>
+        <w:t>Los botones tienen dos colores: el principal (#669966) y el de hover (#2C6E2C). Con esta mezcla se alerta al usuario de que está pasando el ratón por encima del botón, además del uso de la animación.</w:t>
+      </w:r>
+    </w:p>
+    <w:p>
+      <w:pPr>
+        <w:pStyle w:val="Cuerpo"/>
+      </w:pPr>
+      <w:r>
         <w:drawing>
-          <wp:anchor distT="0" distB="0" distL="114300" distR="114300" simplePos="0" relativeHeight="251662336" behindDoc="0" locked="0" layoutInCell="1" allowOverlap="1" wp14:anchorId="42749C49" wp14:editId="6ED38CFE">
+          <wp:anchor distT="0" distB="0" distL="114300" distR="114300" simplePos="0" relativeHeight="251673600" behindDoc="0" locked="0" layoutInCell="1" allowOverlap="1" wp14:anchorId="137DC744" wp14:editId="0B78390B">
             <wp:simplePos x="0" y="0"/>
             <wp:positionH relativeFrom="column">
               <wp:posOffset>891540</wp:posOffset>
             </wp:positionH>
             <wp:positionV relativeFrom="paragraph">
-              <wp:posOffset>649605</wp:posOffset>
+              <wp:posOffset>-97790</wp:posOffset>
             </wp:positionV>
-            <wp:extent cx="1685925" cy="523875"/>
+            <wp:extent cx="1628775" cy="581025"/>
             <wp:effectExtent l="0" t="0" r="9525" b="9525"/>
             <wp:wrapSquare wrapText="bothSides"/>
-            <wp:docPr id="52306079" name="Imagen 1"/>
+            <wp:docPr id="935167654" name="Imagen 1"/>
             <wp:cNvGraphicFramePr>
               <a:graphicFrameLocks xmlns:a="http://schemas.openxmlformats.org/drawingml/2006/main" noChangeAspect="1"/>
             </wp:cNvGraphicFramePr>
@@ -657,54 +1750,36 @@
               <a:graphicData uri="http://schemas.openxmlformats.org/drawingml/2006/picture">
                 <pic:pic xmlns:pic="http://schemas.openxmlformats.org/drawingml/2006/picture">
                   <pic:nvPicPr>
-                    <pic:cNvPr id="52306079" name=""/>
+                    <pic:cNvPr id="935167654" name=""/>
                     <pic:cNvPicPr/>
                   </pic:nvPicPr>
-                  <pic:blipFill rotWithShape="1">
-                    <a:blip r:embed="rId11">
+                  <pic:blipFill>
+                    <a:blip r:embed="rId12">
                       <a:extLst>
                         <a:ext uri="{28A0092B-C50C-407E-A947-70E740481C1C}">
                           <a14:useLocalDpi xmlns:a14="http://schemas.microsoft.com/office/drawing/2010/main" val="0"/>
                         </a:ext>
                       </a:extLst>
                     </a:blip>
-                    <a:srcRect t="12329" b="12329"/>
-                    <a:stretch/>
+                    <a:stretch>
+                      <a:fillRect/>
+                    </a:stretch>
                   </pic:blipFill>
-                  <pic:spPr bwMode="auto">
+                  <pic:spPr>
                     <a:xfrm>
                       <a:off x="0" y="0"/>
-                      <a:ext cx="1685925" cy="523875"/>
+                      <a:ext cx="1628775" cy="581025"/>
                     </a:xfrm>
                     <a:prstGeom prst="rect">
                       <a:avLst/>
                     </a:prstGeom>
-                    <a:ln>
-                      <a:noFill/>
-                    </a:ln>
-                    <a:extLst>
-                      <a:ext uri="{53640926-AAD7-44D8-BBD7-CCE9431645EC}">
-                        <a14:shadowObscured xmlns:a14="http://schemas.microsoft.com/office/drawing/2010/main"/>
-                      </a:ext>
-                    </a:extLst>
                   </pic:spPr>
                 </pic:pic>
               </a:graphicData>
             </a:graphic>
-            <wp14:sizeRelV relativeFrom="margin">
-              <wp14:pctHeight>0</wp14:pctHeight>
-            </wp14:sizeRelV>
           </wp:anchor>
         </w:drawing>
       </w:r>
-      <w:r>
-        <w:t>Los botones tienen dos colores: el principal (#669966) y el de hover (#2C6E2C). Con esta mezcla se alerta al usuario de que está pasando el ratón por encima del botón, además del uso de la animación.</w:t>
-      </w:r>
-    </w:p>
-    <w:p>
-      <w:pPr>
-        <w:pStyle w:val="Cuerpo"/>
-      </w:pPr>
     </w:p>
     <w:p>
       <w:pPr>
@@ -715,10 +1790,12 @@
       <w:pPr>
         <w:pStyle w:val="Subttulos"/>
       </w:pPr>
+      <w:bookmarkStart w:id="4" w:name="_Toc191916015"/>
       <w:r>
         <w:lastRenderedPageBreak/>
         <w:t>Enlaces</w:t>
       </w:r>
+      <w:bookmarkEnd w:id="4"/>
     </w:p>
     <w:p>
       <w:pPr>
@@ -752,7 +1829,7 @@
                     <pic:cNvPicPr/>
                   </pic:nvPicPr>
                   <pic:blipFill>
-                    <a:blip r:embed="rId12">
+                    <a:blip r:embed="rId13">
                       <a:extLst>
                         <a:ext uri="{28A0092B-C50C-407E-A947-70E740481C1C}">
                           <a14:useLocalDpi xmlns:a14="http://schemas.microsoft.com/office/drawing/2010/main" val="0"/>
@@ -832,7 +1909,7 @@
                     <pic:cNvPicPr/>
                   </pic:nvPicPr>
                   <pic:blipFill>
-                    <a:blip r:embed="rId13">
+                    <a:blip r:embed="rId14">
                       <a:extLst>
                         <a:ext uri="{28A0092B-C50C-407E-A947-70E740481C1C}">
                           <a14:useLocalDpi xmlns:a14="http://schemas.microsoft.com/office/drawing/2010/main" val="0"/>
@@ -868,31 +1945,30 @@
       <w:pPr>
         <w:pStyle w:val="Subttulos"/>
       </w:pPr>
+      <w:bookmarkStart w:id="5" w:name="_Toc191916016"/>
       <w:r>
         <w:t>Footer</w:t>
       </w:r>
-    </w:p>
-    <w:p>
-      <w:pPr>
-        <w:pStyle w:val="Cuerpo"/>
-      </w:pPr>
-      <w:r>
-        <w:t>El color de fondo del footer es un tono similar al color principal (#669966), pero algo más oscuro; esta elección se debe a la necesidad de establecer un buen cierre para la página, para darle el sentido de “peso” que tienen las partes inferiores. Es sutil pero se nota.</w:t>
-      </w:r>
-    </w:p>
-    <w:p>
-      <w:pPr>
-        <w:pStyle w:val="Cuerpo"/>
-      </w:pPr>
-      <w:r>
-        <w:rPr>
-          <w:noProof/>
-        </w:rPr>
+      <w:bookmarkEnd w:id="5"/>
+    </w:p>
+    <w:p>
+      <w:pPr>
+        <w:pStyle w:val="Cuerpo"/>
+      </w:pPr>
+      <w:r>
         <w:drawing>
-          <wp:inline distT="0" distB="0" distL="0" distR="0" wp14:anchorId="780EA939" wp14:editId="7C2D2EBB">
-            <wp:extent cx="5400040" cy="873760"/>
-            <wp:effectExtent l="0" t="0" r="0" b="2540"/>
-            <wp:docPr id="144567463" name="Imagen 1"/>
+          <wp:anchor distT="0" distB="0" distL="114300" distR="114300" simplePos="0" relativeHeight="251672576" behindDoc="0" locked="0" layoutInCell="1" allowOverlap="1" wp14:anchorId="4E1F39EA" wp14:editId="279E72CC">
+            <wp:simplePos x="0" y="0"/>
+            <wp:positionH relativeFrom="margin">
+              <wp:align>center</wp:align>
+            </wp:positionH>
+            <wp:positionV relativeFrom="paragraph">
+              <wp:posOffset>1006475</wp:posOffset>
+            </wp:positionV>
+            <wp:extent cx="6266522" cy="1028700"/>
+            <wp:effectExtent l="0" t="0" r="1270" b="0"/>
+            <wp:wrapSquare wrapText="bothSides"/>
+            <wp:docPr id="631971125" name="Imagen 1"/>
             <wp:cNvGraphicFramePr>
               <a:graphicFrameLocks xmlns:a="http://schemas.openxmlformats.org/drawingml/2006/main" noChangeAspect="1"/>
             </wp:cNvGraphicFramePr>
@@ -900,11 +1976,17 @@
               <a:graphicData uri="http://schemas.openxmlformats.org/drawingml/2006/picture">
                 <pic:pic xmlns:pic="http://schemas.openxmlformats.org/drawingml/2006/picture">
                   <pic:nvPicPr>
-                    <pic:cNvPr id="144567463" name=""/>
+                    <pic:cNvPr id="631971125" name=""/>
                     <pic:cNvPicPr/>
                   </pic:nvPicPr>
                   <pic:blipFill>
-                    <a:blip r:embed="rId14"/>
+                    <a:blip r:embed="rId15" cstate="print">
+                      <a:extLst>
+                        <a:ext uri="{28A0092B-C50C-407E-A947-70E740481C1C}">
+                          <a14:useLocalDpi xmlns:a14="http://schemas.microsoft.com/office/drawing/2010/main" val="0"/>
+                        </a:ext>
+                      </a:extLst>
+                    </a:blip>
                     <a:stretch>
                       <a:fillRect/>
                     </a:stretch>
@@ -912,7 +1994,7 @@
                   <pic:spPr>
                     <a:xfrm>
                       <a:off x="0" y="0"/>
-                      <a:ext cx="5400040" cy="873760"/>
+                      <a:ext cx="6266522" cy="1028700"/>
                     </a:xfrm>
                     <a:prstGeom prst="rect">
                       <a:avLst/>
@@ -921,9 +2003,17 @@
                 </pic:pic>
               </a:graphicData>
             </a:graphic>
-          </wp:inline>
+          </wp:anchor>
         </w:drawing>
       </w:r>
+      <w:r>
+        <w:t>El color de fondo del footer es un tono similar al color principal (#669966), pero algo más oscuro; esta elección se debe a la necesidad de establecer un buen cierre para la página, para darle el sentido de “peso” que tienen las partes inferiores. Es sutil pero se nota.</w:t>
+      </w:r>
+    </w:p>
+    <w:p>
+      <w:pPr>
+        <w:pStyle w:val="Cuerpo"/>
+      </w:pPr>
     </w:p>
     <w:p>
       <w:pPr>
@@ -941,10 +2031,12 @@
       <w:pPr>
         <w:pStyle w:val="Ttulos"/>
       </w:pPr>
+      <w:bookmarkStart w:id="6" w:name="_Toc191916017"/>
       <w:r>
         <w:lastRenderedPageBreak/>
         <w:t>Tipografías</w:t>
       </w:r>
+      <w:bookmarkEnd w:id="6"/>
     </w:p>
     <w:p>
       <w:pPr>
@@ -988,11 +2080,125 @@
         <w:pStyle w:val="Cuerpo"/>
       </w:pPr>
       <w:r>
+        <w:drawing>
+          <wp:anchor distT="0" distB="0" distL="114300" distR="114300" simplePos="0" relativeHeight="251677696" behindDoc="0" locked="0" layoutInCell="1" allowOverlap="1" wp14:anchorId="7A1329F6" wp14:editId="33F98CFA">
+            <wp:simplePos x="0" y="0"/>
+            <wp:positionH relativeFrom="margin">
+              <wp:align>center</wp:align>
+            </wp:positionH>
+            <wp:positionV relativeFrom="paragraph">
+              <wp:posOffset>436245</wp:posOffset>
+            </wp:positionV>
+            <wp:extent cx="6325870" cy="2076450"/>
+            <wp:effectExtent l="0" t="0" r="0" b="0"/>
+            <wp:wrapSquare wrapText="bothSides"/>
+            <wp:docPr id="1539091476" name="Imagen 1"/>
+            <wp:cNvGraphicFramePr>
+              <a:graphicFrameLocks xmlns:a="http://schemas.openxmlformats.org/drawingml/2006/main" noChangeAspect="1"/>
+            </wp:cNvGraphicFramePr>
+            <a:graphic xmlns:a="http://schemas.openxmlformats.org/drawingml/2006/main">
+              <a:graphicData uri="http://schemas.openxmlformats.org/drawingml/2006/picture">
+                <pic:pic xmlns:pic="http://schemas.openxmlformats.org/drawingml/2006/picture">
+                  <pic:nvPicPr>
+                    <pic:cNvPr id="1539091476" name=""/>
+                    <pic:cNvPicPr/>
+                  </pic:nvPicPr>
+                  <pic:blipFill>
+                    <a:blip r:embed="rId16">
+                      <a:extLst>
+                        <a:ext uri="{28A0092B-C50C-407E-A947-70E740481C1C}">
+                          <a14:useLocalDpi xmlns:a14="http://schemas.microsoft.com/office/drawing/2010/main" val="0"/>
+                        </a:ext>
+                      </a:extLst>
+                    </a:blip>
+                    <a:stretch>
+                      <a:fillRect/>
+                    </a:stretch>
+                  </pic:blipFill>
+                  <pic:spPr>
+                    <a:xfrm>
+                      <a:off x="0" y="0"/>
+                      <a:ext cx="6325870" cy="2076450"/>
+                    </a:xfrm>
+                    <a:prstGeom prst="rect">
+                      <a:avLst/>
+                    </a:prstGeom>
+                  </pic:spPr>
+                </pic:pic>
+              </a:graphicData>
+            </a:graphic>
+            <wp14:sizeRelH relativeFrom="margin">
+              <wp14:pctWidth>0</wp14:pctWidth>
+            </wp14:sizeRelH>
+            <wp14:sizeRelV relativeFrom="margin">
+              <wp14:pctHeight>0</wp14:pctHeight>
+            </wp14:sizeRelV>
+          </wp:anchor>
+        </w:drawing>
+      </w:r>
+      <w:r>
+        <w:drawing>
+          <wp:anchor distT="0" distB="0" distL="114300" distR="114300" simplePos="0" relativeHeight="251675648" behindDoc="0" locked="0" layoutInCell="1" allowOverlap="1" wp14:anchorId="4948961C" wp14:editId="77F77FF3">
+            <wp:simplePos x="0" y="0"/>
+            <wp:positionH relativeFrom="margin">
+              <wp:align>center</wp:align>
+            </wp:positionH>
+            <wp:positionV relativeFrom="paragraph">
+              <wp:posOffset>5173345</wp:posOffset>
+            </wp:positionV>
+            <wp:extent cx="5800725" cy="1831975"/>
+            <wp:effectExtent l="0" t="0" r="9525" b="0"/>
+            <wp:wrapSquare wrapText="bothSides"/>
+            <wp:docPr id="899314331" name="Imagen 1"/>
+            <wp:cNvGraphicFramePr>
+              <a:graphicFrameLocks xmlns:a="http://schemas.openxmlformats.org/drawingml/2006/main" noChangeAspect="1"/>
+            </wp:cNvGraphicFramePr>
+            <a:graphic xmlns:a="http://schemas.openxmlformats.org/drawingml/2006/main">
+              <a:graphicData uri="http://schemas.openxmlformats.org/drawingml/2006/picture">
+                <pic:pic xmlns:pic="http://schemas.openxmlformats.org/drawingml/2006/picture">
+                  <pic:nvPicPr>
+                    <pic:cNvPr id="899314331" name=""/>
+                    <pic:cNvPicPr/>
+                  </pic:nvPicPr>
+                  <pic:blipFill>
+                    <a:blip r:embed="rId17">
+                      <a:extLst>
+                        <a:ext uri="{28A0092B-C50C-407E-A947-70E740481C1C}">
+                          <a14:useLocalDpi xmlns:a14="http://schemas.microsoft.com/office/drawing/2010/main" val="0"/>
+                        </a:ext>
+                      </a:extLst>
+                    </a:blip>
+                    <a:stretch>
+                      <a:fillRect/>
+                    </a:stretch>
+                  </pic:blipFill>
+                  <pic:spPr>
+                    <a:xfrm>
+                      <a:off x="0" y="0"/>
+                      <a:ext cx="5800725" cy="1831975"/>
+                    </a:xfrm>
+                    <a:prstGeom prst="rect">
+                      <a:avLst/>
+                    </a:prstGeom>
+                  </pic:spPr>
+                </pic:pic>
+              </a:graphicData>
+            </a:graphic>
+            <wp14:sizeRelH relativeFrom="margin">
+              <wp14:pctWidth>0</wp14:pctWidth>
+            </wp14:sizeRelH>
+            <wp14:sizeRelV relativeFrom="margin">
+              <wp14:pctHeight>0</wp14:pctHeight>
+            </wp14:sizeRelV>
+          </wp:anchor>
+        </w:drawing>
+      </w:r>
+      <w:r>
         <w:rPr>
           <w:noProof/>
         </w:rPr>
         <w:drawing>
-          <wp:anchor distT="0" distB="0" distL="114300" distR="114300" simplePos="0" relativeHeight="251667456" behindDoc="0" locked="0" layoutInCell="1" allowOverlap="1" wp14:anchorId="4A98340F" wp14:editId="7DD65405">
+          <wp:anchor distT="0" distB="0" distL="114300" distR="114300" simplePos="0" relativeHeight="251667456" behindDoc="0" locked="0" layoutInCell="1" allowOverlap="1" wp14:anchorId="4A98340F" wp14:editId="7B3E4C58">
             <wp:simplePos x="0" y="0"/>
             <wp:positionH relativeFrom="margin">
               <wp:align>center</wp:align>
@@ -1015,7 +2221,7 @@
                     <pic:cNvPicPr/>
                   </pic:nvPicPr>
                   <pic:blipFill>
-                    <a:blip r:embed="rId15">
+                    <a:blip r:embed="rId18">
                       <a:extLst>
                         <a:ext uri="{28A0092B-C50C-407E-A947-70E740481C1C}">
                           <a14:useLocalDpi xmlns:a14="http://schemas.microsoft.com/office/drawing/2010/main" val="0"/>
@@ -1048,22 +2254,279 @@
         </w:drawing>
       </w:r>
       <w:r>
-        <w:rPr>
-          <w:noProof/>
-        </w:rPr>
+        <w:t>Hemos seleccionado</w:t>
+      </w:r>
+      <w:r>
+        <w:t xml:space="preserve"> tres</w:t>
+      </w:r>
+      <w:r>
+        <w:t xml:space="preserve"> tipografías principales: una con serifa y otra sin serifa. Las elegidas son </w:t>
+      </w:r>
+      <w:r>
+        <w:t>Fanlste para títulos, TT Chocolates para textos y Apollo para enlaces.</w:t>
+      </w:r>
+    </w:p>
+    <w:p>
+      <w:pPr>
+        <w:pStyle w:val="Subttulos"/>
+      </w:pPr>
+      <w:bookmarkStart w:id="7" w:name="_Toc191916018"/>
+      <w:r>
+        <w:lastRenderedPageBreak/>
+        <w:t>Fanlste</w:t>
+      </w:r>
+      <w:bookmarkEnd w:id="7"/>
+    </w:p>
+    <w:p>
+      <w:pPr>
+        <w:pStyle w:val="Cuerpo"/>
+      </w:pPr>
+      <w:r>
+        <w:t>Esta tipografía con serifa tiene un encanto único: tiene un grosor variable, siendo más fina en las curvas y más gruesa en las partes rectas. Tiene un carácter elegante, clásico y fresco a la vez. La hemos seleccionado por su buena legibilidad, además de por las modificaciones con diferentes caracteres especiales (empleados en la página web), para darle un toque diferente y especial. La hemos utilizado para los títulos, encontrándola en los H1 y los H3.</w:t>
+      </w:r>
+    </w:p>
+    <w:p>
+      <w:pPr>
+        <w:pStyle w:val="Cuerpo"/>
+      </w:pPr>
+      <w:r>
+        <w:t>Los colores utilizados en esta fuente son el color texto (#184B2C) para los H1</w:t>
+      </w:r>
+      <w:r>
+        <w:t>, ya que sólo aparecerán sobre fondo blanco,</w:t>
+      </w:r>
+      <w:r>
+        <w:t xml:space="preserve"> y el verde más claro (#B4E7AA) para los H3</w:t>
+      </w:r>
+      <w:r>
+        <w:t>, que aparecerán únicamente en fondo oscuro</w:t>
+      </w:r>
+      <w:r>
+        <w:t>.</w:t>
+      </w:r>
+    </w:p>
+    <w:p>
+      <w:pPr>
+        <w:pStyle w:val="Cuerpo"/>
+      </w:pPr>
+      <w:r>
+        <w:t>Los tamaños son 4em para los H1 y 1.5em para los H3.</w:t>
+      </w:r>
+    </w:p>
+    <w:p>
+      <w:pPr>
+        <w:pStyle w:val="Cuerpo"/>
+        <w:rPr>
+          <w:rFonts w:ascii="fanlste" w:hAnsi="fanlste"/>
+          <w:color w:val="184B2C"/>
+          <w:sz w:val="96"/>
+          <w:szCs w:val="96"/>
+        </w:rPr>
+      </w:pPr>
+      <w:r>
+        <w:rPr>
+          <w:rFonts w:ascii="fanlste" w:hAnsi="fanlste"/>
+          <w:color w:val="184B2C"/>
+          <w:sz w:val="96"/>
+          <w:szCs w:val="96"/>
+        </w:rPr>
+        <w:t>Esto es un título (H1)</w:t>
+      </w:r>
+    </w:p>
+    <w:p>
+      <w:pPr>
+        <w:pStyle w:val="Cuerpo"/>
+        <w:rPr>
+          <w:rFonts w:ascii="fanlste" w:hAnsi="fanlste"/>
+          <w:color w:val="B4E7AA"/>
+          <w:sz w:val="36"/>
+          <w:szCs w:val="36"/>
+        </w:rPr>
+      </w:pPr>
+      <w:r>
+        <w:rPr>
+          <w:rFonts w:ascii="fanlste" w:hAnsi="fanlste"/>
+          <w:color w:val="B4E7AA"/>
+          <w:sz w:val="36"/>
+          <w:szCs w:val="36"/>
+        </w:rPr>
+        <w:t>Esto es un título (H3)</w:t>
+      </w:r>
+    </w:p>
+    <w:p>
+      <w:pPr>
+        <w:pStyle w:val="Cuerpo"/>
+      </w:pPr>
+    </w:p>
+    <w:p>
+      <w:pPr>
+        <w:pStyle w:val="Cuerpo"/>
+      </w:pPr>
+    </w:p>
+    <w:p>
+      <w:pPr>
+        <w:pStyle w:val="Subttulos"/>
+      </w:pPr>
+      <w:bookmarkStart w:id="8" w:name="_Toc191916019"/>
+      <w:r>
+        <w:t>Chocolates</w:t>
+      </w:r>
+      <w:bookmarkEnd w:id="8"/>
+    </w:p>
+    <w:p>
+      <w:pPr>
+        <w:pStyle w:val="Cuerpo"/>
+      </w:pPr>
+      <w:r>
+        <w:t>Esta tipografía es una fuente de palo seco (sans), y es la elegida para los textos P. Es una fuente limpia y clara, que encaja bastante bien con la Fanlste porque también tiene un estilo redondeado, pero destaca por la pequeña variación que existe en la altura X (es la altura de las letras que no tienen ascendente ni descendente), lo que la hace resultar algo juguetona. Concretamente se ha usado la variante Light, aunque a veces se le añade las etiquetas correspondientes para mostrarla en itálica (&lt;i&gt;&lt;/i&gt;) o en negrita (&lt;b&gt;&lt;/b&gt;).</w:t>
+      </w:r>
+    </w:p>
+    <w:p>
+      <w:pPr>
+        <w:pStyle w:val="Cuerpo"/>
+      </w:pPr>
+      <w:r>
+        <w:t>El color empleado en esta fuente es el color texto (#184B2C), ya que sólo aparecerá sobre fondo claro; si apareciese sobre fondo oscuro, el color sería el blanco (ya que, al ser tan fina, si se utilizase el verde más claro se vería peor).</w:t>
+      </w:r>
+    </w:p>
+    <w:p>
+      <w:pPr>
+        <w:pStyle w:val="Cuerpo"/>
+      </w:pPr>
+      <w:r>
+        <w:t>El tamaño empleado es 1.4em.</w:t>
+      </w:r>
+    </w:p>
+    <w:p>
+      <w:pPr>
+        <w:pStyle w:val="Cuerpo"/>
+        <w:spacing w:line="240" w:lineRule="auto"/>
+        <w:rPr>
+          <w:color w:val="184B2C"/>
+          <w:sz w:val="34"/>
+          <w:szCs w:val="34"/>
+        </w:rPr>
+      </w:pPr>
+      <w:r>
+        <w:rPr>
+          <w:color w:val="184B2C"/>
+          <w:sz w:val="34"/>
+          <w:szCs w:val="34"/>
+        </w:rPr>
+        <w:t>Esto es un texto de párrafo (P).</w:t>
+      </w:r>
+    </w:p>
+    <w:p>
+      <w:pPr>
+        <w:pStyle w:val="Cuerpo"/>
+        <w:spacing w:line="240" w:lineRule="auto"/>
+        <w:rPr>
+          <w:color w:val="184B2C"/>
+          <w:sz w:val="34"/>
+          <w:szCs w:val="34"/>
+        </w:rPr>
+      </w:pPr>
+      <w:r>
+        <w:rPr>
+          <w:i/>
+          <w:iCs/>
+          <w:color w:val="184B2C"/>
+          <w:sz w:val="34"/>
+          <w:szCs w:val="34"/>
+        </w:rPr>
+        <w:t>Esto es un texto de párrafo en cursiva</w:t>
+      </w:r>
+      <w:r>
+        <w:rPr>
+          <w:color w:val="184B2C"/>
+          <w:sz w:val="34"/>
+          <w:szCs w:val="34"/>
+        </w:rPr>
+        <w:t xml:space="preserve">. </w:t>
+      </w:r>
+    </w:p>
+    <w:p>
+      <w:pPr>
+        <w:pStyle w:val="Cuerpo"/>
+        <w:spacing w:line="240" w:lineRule="auto"/>
+        <w:rPr>
+          <w:b/>
+          <w:bCs/>
+          <w:color w:val="184B2C"/>
+          <w:sz w:val="34"/>
+          <w:szCs w:val="34"/>
+        </w:rPr>
+      </w:pPr>
+      <w:r>
+        <w:rPr>
+          <w:b/>
+          <w:bCs/>
+          <w:color w:val="184B2C"/>
+          <w:sz w:val="34"/>
+          <w:szCs w:val="34"/>
+        </w:rPr>
+        <w:t>Esto es un texto de párrafo en negrita.</w:t>
+      </w:r>
+    </w:p>
+    <w:p>
+      <w:pPr>
+        <w:pStyle w:val="Subttulos"/>
+      </w:pPr>
+      <w:bookmarkStart w:id="9" w:name="_Toc191916020"/>
+      <w:r>
+        <w:lastRenderedPageBreak/>
+        <w:t>Apollo</w:t>
+      </w:r>
+      <w:bookmarkEnd w:id="9"/>
+    </w:p>
+    <w:p>
+      <w:pPr>
+        <w:pStyle w:val="Cuerpo"/>
+      </w:pPr>
+      <w:r>
+        <w:t>Esta es una fuente sans, al igual que la tipografía anterior, y es la aplicada a los enlaces (&lt;a&gt;&lt;/a&gt;). La hemos elegido porque hemos pensado que era el punto intermedio perfecto entre la Fanlste y la Chocolates: es redondeada y presenta variación en el grosor dependiendo de las curvas y las rectas, pero tiene una altura X igual, lo que la hace más madura.</w:t>
+      </w:r>
+    </w:p>
+    <w:p>
+      <w:pPr>
+        <w:pStyle w:val="Cuerpo"/>
+      </w:pPr>
+      <w:r>
+        <w:t>El color empleado es el color texto (#184B2C) cuando aparece en el header, como un enlace, o cuando aparece sobre fondos oscuros; también se utiliza el blanco para cuando aparece sobre fondos oscuros o como botón. Sin embargo, en ambas ocasiones, al pasar el ratón por encima (hover) aparece con el color verde claro (#B4E7AA).</w:t>
+      </w:r>
+    </w:p>
+    <w:p>
+      <w:pPr>
+        <w:pStyle w:val="Cuerpo"/>
+      </w:pPr>
+      <w:r>
+        <w:t xml:space="preserve">El tamaño con el que se muestra es el que trae por defecto; la única variación es que suele aparecer en mayúscula tanto en botones como en el header, mostrándose </w:t>
+      </w:r>
+      <w:r>
+        <w:t xml:space="preserve">con minúsculas </w:t>
+      </w:r>
+      <w:r>
+        <w:t>únicamente en el footer.</w:t>
+      </w:r>
+    </w:p>
+    <w:p>
+      <w:pPr>
+        <w:pStyle w:val="Cuerpo"/>
+      </w:pPr>
+      <w:r>
         <w:drawing>
-          <wp:anchor distT="0" distB="0" distL="114300" distR="114300" simplePos="0" relativeHeight="251666432" behindDoc="0" locked="0" layoutInCell="1" allowOverlap="1" wp14:anchorId="06FB45EE" wp14:editId="4A81EBDB">
+          <wp:anchor distT="0" distB="0" distL="114300" distR="114300" simplePos="0" relativeHeight="251676672" behindDoc="0" locked="0" layoutInCell="1" allowOverlap="1" wp14:anchorId="676EA6D4" wp14:editId="262E0075">
             <wp:simplePos x="0" y="0"/>
             <wp:positionH relativeFrom="margin">
               <wp:align>center</wp:align>
             </wp:positionH>
             <wp:positionV relativeFrom="paragraph">
-              <wp:posOffset>512445</wp:posOffset>
+              <wp:posOffset>5715</wp:posOffset>
             </wp:positionV>
-            <wp:extent cx="5962650" cy="1934845"/>
-            <wp:effectExtent l="0" t="0" r="0" b="8255"/>
+            <wp:extent cx="2362530" cy="609685"/>
+            <wp:effectExtent l="0" t="0" r="0" b="0"/>
             <wp:wrapSquare wrapText="bothSides"/>
-            <wp:docPr id="1502985682" name="Imagen 1"/>
+            <wp:docPr id="324772001" name="Imagen 1"/>
             <wp:cNvGraphicFramePr>
               <a:graphicFrameLocks xmlns:a="http://schemas.openxmlformats.org/drawingml/2006/main" noChangeAspect="1"/>
             </wp:cNvGraphicFramePr>
@@ -1071,446 +2534,7 @@
               <a:graphicData uri="http://schemas.openxmlformats.org/drawingml/2006/picture">
                 <pic:pic xmlns:pic="http://schemas.openxmlformats.org/drawingml/2006/picture">
                   <pic:nvPicPr>
-                    <pic:cNvPr id="1502985682" name=""/>
-                    <pic:cNvPicPr/>
-                  </pic:nvPicPr>
-                  <pic:blipFill>
-                    <a:blip r:embed="rId16">
-                      <a:extLst>
-                        <a:ext uri="{28A0092B-C50C-407E-A947-70E740481C1C}">
-                          <a14:useLocalDpi xmlns:a14="http://schemas.microsoft.com/office/drawing/2010/main" val="0"/>
-                        </a:ext>
-                      </a:extLst>
-                    </a:blip>
-                    <a:stretch>
-                      <a:fillRect/>
-                    </a:stretch>
-                  </pic:blipFill>
-                  <pic:spPr>
-                    <a:xfrm>
-                      <a:off x="0" y="0"/>
-                      <a:ext cx="5962650" cy="1934845"/>
-                    </a:xfrm>
-                    <a:prstGeom prst="rect">
-                      <a:avLst/>
-                    </a:prstGeom>
-                  </pic:spPr>
-                </pic:pic>
-              </a:graphicData>
-            </a:graphic>
-            <wp14:sizeRelH relativeFrom="margin">
-              <wp14:pctWidth>0</wp14:pctWidth>
-            </wp14:sizeRelH>
-            <wp14:sizeRelV relativeFrom="margin">
-              <wp14:pctHeight>0</wp14:pctHeight>
-            </wp14:sizeRelV>
-          </wp:anchor>
-        </w:drawing>
-      </w:r>
-      <w:r>
-        <w:t>Hemos seleccionado</w:t>
-      </w:r>
-      <w:r>
-        <w:t xml:space="preserve"> tres</w:t>
-      </w:r>
-      <w:r>
-        <w:t xml:space="preserve"> tipografías principales: una con serifa y otra sin serifa. Las elegidas son </w:t>
-      </w:r>
-      <w:r>
-        <w:t>Fanlste para títulos, TT Chocolates para textos y Apollo para enlaces.</w:t>
-      </w:r>
-    </w:p>
-    <w:p>
-      <w:pPr>
-        <w:pStyle w:val="Cuerpo"/>
-      </w:pPr>
-      <w:r>
-        <w:rPr>
-          <w:noProof/>
-        </w:rPr>
-        <w:drawing>
-          <wp:anchor distT="0" distB="0" distL="114300" distR="114300" simplePos="0" relativeHeight="251668480" behindDoc="0" locked="0" layoutInCell="1" allowOverlap="1" wp14:anchorId="7491950A" wp14:editId="30763340">
-            <wp:simplePos x="0" y="0"/>
-            <wp:positionH relativeFrom="margin">
-              <wp:align>center</wp:align>
-            </wp:positionH>
-            <wp:positionV relativeFrom="paragraph">
-              <wp:posOffset>4890135</wp:posOffset>
-            </wp:positionV>
-            <wp:extent cx="5644515" cy="1609725"/>
-            <wp:effectExtent l="0" t="0" r="0" b="9525"/>
-            <wp:wrapSquare wrapText="bothSides"/>
-            <wp:docPr id="742457723" name="Imagen 1"/>
-            <wp:cNvGraphicFramePr>
-              <a:graphicFrameLocks xmlns:a="http://schemas.openxmlformats.org/drawingml/2006/main" noChangeAspect="1"/>
-            </wp:cNvGraphicFramePr>
-            <a:graphic xmlns:a="http://schemas.openxmlformats.org/drawingml/2006/main">
-              <a:graphicData uri="http://schemas.openxmlformats.org/drawingml/2006/picture">
-                <pic:pic xmlns:pic="http://schemas.openxmlformats.org/drawingml/2006/picture">
-                  <pic:nvPicPr>
-                    <pic:cNvPr id="742457723" name=""/>
-                    <pic:cNvPicPr/>
-                  </pic:nvPicPr>
-                  <pic:blipFill>
-                    <a:blip r:embed="rId17">
-                      <a:extLst>
-                        <a:ext uri="{28A0092B-C50C-407E-A947-70E740481C1C}">
-                          <a14:useLocalDpi xmlns:a14="http://schemas.microsoft.com/office/drawing/2010/main" val="0"/>
-                        </a:ext>
-                      </a:extLst>
-                    </a:blip>
-                    <a:stretch>
-                      <a:fillRect/>
-                    </a:stretch>
-                  </pic:blipFill>
-                  <pic:spPr>
-                    <a:xfrm>
-                      <a:off x="0" y="0"/>
-                      <a:ext cx="5644515" cy="1609725"/>
-                    </a:xfrm>
-                    <a:prstGeom prst="rect">
-                      <a:avLst/>
-                    </a:prstGeom>
-                  </pic:spPr>
-                </pic:pic>
-              </a:graphicData>
-            </a:graphic>
-            <wp14:sizeRelH relativeFrom="margin">
-              <wp14:pctWidth>0</wp14:pctWidth>
-            </wp14:sizeRelH>
-            <wp14:sizeRelV relativeFrom="margin">
-              <wp14:pctHeight>0</wp14:pctHeight>
-            </wp14:sizeRelV>
-          </wp:anchor>
-        </w:drawing>
-      </w:r>
-    </w:p>
-    <w:p>
-      <w:pPr>
-        <w:pStyle w:val="Subttulos"/>
-      </w:pPr>
-      <w:r>
-        <w:lastRenderedPageBreak/>
-        <w:t>Fanlste</w:t>
-      </w:r>
-    </w:p>
-    <w:p>
-      <w:pPr>
-        <w:pStyle w:val="Cuerpo"/>
-      </w:pPr>
-      <w:r>
-        <w:t>Esta tipografía con serifa tiene un encanto único: tiene un grosor variable, siendo más fina en las curvas y más gruesa en las partes rectas. Tiene un carácter elegante, clásico y fresco a la vez. La hemos seleccionado por su buena legibilidad, además de por las modificaciones con diferentes caracteres especiales (empleados en la página web), para darle un toque diferente y especial. La hemos utilizado para los títulos, encontrándola en los H1 y los H3.</w:t>
-      </w:r>
-    </w:p>
-    <w:p>
-      <w:pPr>
-        <w:pStyle w:val="Cuerpo"/>
-      </w:pPr>
-      <w:r>
-        <w:t>Los colores utilizados en esta fuente son el color texto (#184B2C) para los H1</w:t>
-      </w:r>
-      <w:r>
-        <w:t>, ya que sólo aparecerán sobre fondo blanco,</w:t>
-      </w:r>
-      <w:r>
-        <w:t xml:space="preserve"> y el verde más claro (#B4E7AA) para los H3</w:t>
-      </w:r>
-      <w:r>
-        <w:t>, que aparecerán únicamente en fondo oscuro</w:t>
-      </w:r>
-      <w:r>
-        <w:t>.</w:t>
-      </w:r>
-    </w:p>
-    <w:p>
-      <w:pPr>
-        <w:pStyle w:val="Cuerpo"/>
-      </w:pPr>
-      <w:r>
-        <w:t>Los tamaños son 4em para los H1 y 1.5em para los H3.</w:t>
-      </w:r>
-    </w:p>
-    <w:p>
-      <w:pPr>
-        <w:pStyle w:val="Cuerpo"/>
-        <w:rPr>
-          <w:rFonts w:ascii="fanlste" w:hAnsi="fanlste"/>
-          <w:color w:val="184B2C"/>
-          <w:sz w:val="96"/>
-          <w:szCs w:val="96"/>
-        </w:rPr>
-      </w:pPr>
-      <w:r>
-        <w:rPr>
-          <w:rFonts w:ascii="fanlste" w:hAnsi="fanlste"/>
-          <w:color w:val="184B2C"/>
-          <w:sz w:val="96"/>
-          <w:szCs w:val="96"/>
-        </w:rPr>
-        <w:t>Esto es un título (H1)</w:t>
-      </w:r>
-    </w:p>
-    <w:p>
-      <w:pPr>
-        <w:pStyle w:val="Cuerpo"/>
-        <w:rPr>
-          <w:rFonts w:ascii="fanlste" w:hAnsi="fanlste"/>
-          <w:color w:val="B4E7AA"/>
-          <w:sz w:val="36"/>
-          <w:szCs w:val="36"/>
-        </w:rPr>
-      </w:pPr>
-      <w:r>
-        <w:rPr>
-          <w:rFonts w:ascii="fanlste" w:hAnsi="fanlste"/>
-          <w:color w:val="B4E7AA"/>
-          <w:sz w:val="36"/>
-          <w:szCs w:val="36"/>
-        </w:rPr>
-        <w:t>Esto es un título (H3)</w:t>
-      </w:r>
-    </w:p>
-    <w:p>
-      <w:pPr>
-        <w:pStyle w:val="Cuerpo"/>
-      </w:pPr>
-    </w:p>
-    <w:p>
-      <w:pPr>
-        <w:pStyle w:val="Cuerpo"/>
-      </w:pPr>
-    </w:p>
-    <w:p>
-      <w:pPr>
-        <w:pStyle w:val="Subttulos"/>
-      </w:pPr>
-      <w:r>
-        <w:t>Chocolates</w:t>
-      </w:r>
-    </w:p>
-    <w:p>
-      <w:pPr>
-        <w:pStyle w:val="Cuerpo"/>
-      </w:pPr>
-      <w:r>
-        <w:t>Esta tipografía es una fuente de palo seco (sans), y es la elegida para los textos P. Es una fuente limpia y clara, que encaja bastante bien con la Fanlste porque también tiene un estilo redondeado, pero destaca por la pequeña variación que existe en la altura X (es la altura de las letras que no tienen ascendente ni descendente), lo que la hace resultar algo juguetona. Concretamente se ha usado la variante Light, aunque a veces se le añade las etiquetas correspondientes para mostrarla en itálica (&lt;i&gt;&lt;/i&gt;) o en negrita (&lt;b&gt;&lt;/b&gt;).</w:t>
-      </w:r>
-    </w:p>
-    <w:p>
-      <w:pPr>
-        <w:pStyle w:val="Cuerpo"/>
-      </w:pPr>
-      <w:r>
-        <w:t>El color empleado en esta fuente es el color texto (#184B2C), ya que sólo aparecerá sobre fondo claro; si apareciese sobre fondo oscuro, el color sería el blanco (ya que, al ser tan fina, si se utilizase el verde más claro se vería peor).</w:t>
-      </w:r>
-    </w:p>
-    <w:p>
-      <w:pPr>
-        <w:pStyle w:val="Cuerpo"/>
-      </w:pPr>
-      <w:r>
-        <w:t>El tamaño empleado es 1.4em.</w:t>
-      </w:r>
-    </w:p>
-    <w:p>
-      <w:pPr>
-        <w:pStyle w:val="Cuerpo"/>
-        <w:spacing w:line="240" w:lineRule="auto"/>
-        <w:rPr>
-          <w:color w:val="184B2C"/>
-          <w:sz w:val="34"/>
-          <w:szCs w:val="34"/>
-        </w:rPr>
-      </w:pPr>
-      <w:r>
-        <w:rPr>
-          <w:color w:val="184B2C"/>
-          <w:sz w:val="34"/>
-          <w:szCs w:val="34"/>
-        </w:rPr>
-        <w:t>Esto es un texto de párrafo (P).</w:t>
-      </w:r>
-    </w:p>
-    <w:p>
-      <w:pPr>
-        <w:pStyle w:val="Cuerpo"/>
-        <w:spacing w:line="240" w:lineRule="auto"/>
-        <w:rPr>
-          <w:color w:val="184B2C"/>
-          <w:sz w:val="34"/>
-          <w:szCs w:val="34"/>
-        </w:rPr>
-      </w:pPr>
-      <w:r>
-        <w:rPr>
-          <w:i/>
-          <w:iCs/>
-          <w:color w:val="184B2C"/>
-          <w:sz w:val="34"/>
-          <w:szCs w:val="34"/>
-        </w:rPr>
-        <w:t>Esto es un texto de párrafo en cursiva</w:t>
-      </w:r>
-      <w:r>
-        <w:rPr>
-          <w:color w:val="184B2C"/>
-          <w:sz w:val="34"/>
-          <w:szCs w:val="34"/>
-        </w:rPr>
-        <w:t xml:space="preserve">. </w:t>
-      </w:r>
-    </w:p>
-    <w:p>
-      <w:pPr>
-        <w:pStyle w:val="Cuerpo"/>
-        <w:spacing w:line="240" w:lineRule="auto"/>
-        <w:rPr>
-          <w:b/>
-          <w:bCs/>
-          <w:color w:val="184B2C"/>
-          <w:sz w:val="34"/>
-          <w:szCs w:val="34"/>
-        </w:rPr>
-      </w:pPr>
-      <w:r>
-        <w:rPr>
-          <w:b/>
-          <w:bCs/>
-          <w:color w:val="184B2C"/>
-          <w:sz w:val="34"/>
-          <w:szCs w:val="34"/>
-        </w:rPr>
-        <w:t>Esto es un texto de párrafo en negrita.</w:t>
-      </w:r>
-    </w:p>
-    <w:p>
-      <w:pPr>
-        <w:pStyle w:val="Subttulos"/>
-      </w:pPr>
-      <w:r>
-        <w:lastRenderedPageBreak/>
-        <w:t>Apollo</w:t>
-      </w:r>
-    </w:p>
-    <w:p>
-      <w:pPr>
-        <w:pStyle w:val="Cuerpo"/>
-      </w:pPr>
-      <w:r>
-        <w:t>Esta es una fuente sans, al igual que la tipografía anterior, y es la aplicada a los enlaces (&lt;a&gt;&lt;/a&gt;). La hemos elegido porque hemos pensado que era el punto intermedio perfecto entre la Fanlste y la Chocolates: es redondeada y presenta variación en el grosor dependiendo de las curvas y las rectas, pero tiene una altura X igual, lo que la hace más madura.</w:t>
-      </w:r>
-    </w:p>
-    <w:p>
-      <w:pPr>
-        <w:pStyle w:val="Cuerpo"/>
-      </w:pPr>
-      <w:r>
-        <w:t>El color empleado es el color texto (#184B2C) cuando aparece en el header, como un enlace, o cuando aparece sobre fondos oscuros; también se utiliza el blanco para cuando aparece sobre fondos oscuros o como botón. Sin embargo, en ambas ocasiones, al pasar el ratón por encima (hover) aparece con el color verde claro (#B4E7AA).</w:t>
-      </w:r>
-    </w:p>
-    <w:p>
-      <w:pPr>
-        <w:pStyle w:val="Cuerpo"/>
-      </w:pPr>
-      <w:r>
-        <w:rPr>
-          <w:noProof/>
-        </w:rPr>
-        <w:drawing>
-          <wp:anchor distT="0" distB="0" distL="114300" distR="114300" simplePos="0" relativeHeight="251670528" behindDoc="0" locked="0" layoutInCell="1" allowOverlap="1" wp14:anchorId="1CC69F39" wp14:editId="76A4EE4E">
-            <wp:simplePos x="0" y="0"/>
-            <wp:positionH relativeFrom="margin">
-              <wp:align>center</wp:align>
-            </wp:positionH>
-            <wp:positionV relativeFrom="paragraph">
-              <wp:posOffset>620862</wp:posOffset>
-            </wp:positionV>
-            <wp:extent cx="2359025" cy="577850"/>
-            <wp:effectExtent l="0" t="0" r="3175" b="0"/>
-            <wp:wrapSquare wrapText="bothSides"/>
-            <wp:docPr id="1195949209" name="Imagen 1"/>
-            <wp:cNvGraphicFramePr>
-              <a:graphicFrameLocks xmlns:a="http://schemas.openxmlformats.org/drawingml/2006/main" noChangeAspect="1"/>
-            </wp:cNvGraphicFramePr>
-            <a:graphic xmlns:a="http://schemas.openxmlformats.org/drawingml/2006/main">
-              <a:graphicData uri="http://schemas.openxmlformats.org/drawingml/2006/picture">
-                <pic:pic xmlns:pic="http://schemas.openxmlformats.org/drawingml/2006/picture">
-                  <pic:nvPicPr>
-                    <pic:cNvPr id="1195949209" name=""/>
-                    <pic:cNvPicPr/>
-                  </pic:nvPicPr>
-                  <pic:blipFill>
-                    <a:blip r:embed="rId18">
-                      <a:extLst>
-                        <a:ext uri="{28A0092B-C50C-407E-A947-70E740481C1C}">
-                          <a14:useLocalDpi xmlns:a14="http://schemas.microsoft.com/office/drawing/2010/main" val="0"/>
-                        </a:ext>
-                      </a:extLst>
-                    </a:blip>
-                    <a:stretch>
-                      <a:fillRect/>
-                    </a:stretch>
-                  </pic:blipFill>
-                  <pic:spPr>
-                    <a:xfrm>
-                      <a:off x="0" y="0"/>
-                      <a:ext cx="2359025" cy="577850"/>
-                    </a:xfrm>
-                    <a:prstGeom prst="rect">
-                      <a:avLst/>
-                    </a:prstGeom>
-                  </pic:spPr>
-                </pic:pic>
-              </a:graphicData>
-            </a:graphic>
-            <wp14:sizeRelH relativeFrom="margin">
-              <wp14:pctWidth>0</wp14:pctWidth>
-            </wp14:sizeRelH>
-            <wp14:sizeRelV relativeFrom="margin">
-              <wp14:pctHeight>0</wp14:pctHeight>
-            </wp14:sizeRelV>
-          </wp:anchor>
-        </w:drawing>
-      </w:r>
-      <w:r>
-        <w:t xml:space="preserve">El tamaño con el que se muestra es el que trae por defecto; la única variación es que suele aparecer en mayúscula tanto en botones como en el header, mostrándose </w:t>
-      </w:r>
-      <w:r>
-        <w:t xml:space="preserve">con minúsculas </w:t>
-      </w:r>
-      <w:r>
-        <w:t>únicamente en el footer.</w:t>
-      </w:r>
-    </w:p>
-    <w:p>
-      <w:pPr>
-        <w:pStyle w:val="Cuerpo"/>
-      </w:pPr>
-      <w:r>
-        <w:rPr>
-          <w:noProof/>
-        </w:rPr>
-        <w:drawing>
-          <wp:anchor distT="0" distB="0" distL="114300" distR="114300" simplePos="0" relativeHeight="251671552" behindDoc="0" locked="0" layoutInCell="1" allowOverlap="1" wp14:anchorId="3230B4A2" wp14:editId="73723B06">
-            <wp:simplePos x="0" y="0"/>
-            <wp:positionH relativeFrom="margin">
-              <wp:align>center</wp:align>
-            </wp:positionH>
-            <wp:positionV relativeFrom="paragraph">
-              <wp:posOffset>1082795</wp:posOffset>
-            </wp:positionV>
-            <wp:extent cx="1906270" cy="1636395"/>
-            <wp:effectExtent l="0" t="0" r="0" b="1905"/>
-            <wp:wrapSquare wrapText="bothSides"/>
-            <wp:docPr id="1249952040" name="Imagen 1"/>
-            <wp:cNvGraphicFramePr>
-              <a:graphicFrameLocks xmlns:a="http://schemas.openxmlformats.org/drawingml/2006/main" noChangeAspect="1"/>
-            </wp:cNvGraphicFramePr>
-            <a:graphic xmlns:a="http://schemas.openxmlformats.org/drawingml/2006/main">
-              <a:graphicData uri="http://schemas.openxmlformats.org/drawingml/2006/picture">
-                <pic:pic xmlns:pic="http://schemas.openxmlformats.org/drawingml/2006/picture">
-                  <pic:nvPicPr>
-                    <pic:cNvPr id="1249952040" name=""/>
+                    <pic:cNvPr id="324772001" name=""/>
                     <pic:cNvPicPr/>
                   </pic:nvPicPr>
                   <pic:blipFill>
@@ -1528,7 +2552,7 @@
                   <pic:spPr>
                     <a:xfrm>
                       <a:off x="0" y="0"/>
-                      <a:ext cx="1906270" cy="1636395"/>
+                      <a:ext cx="2362530" cy="609685"/>
                     </a:xfrm>
                     <a:prstGeom prst="rect">
                       <a:avLst/>
@@ -1537,27 +2561,31 @@
                 </pic:pic>
               </a:graphicData>
             </a:graphic>
-            <wp14:sizeRelH relativeFrom="margin">
-              <wp14:pctWidth>0</wp14:pctWidth>
-            </wp14:sizeRelH>
-            <wp14:sizeRelV relativeFrom="margin">
-              <wp14:pctHeight>0</wp14:pctHeight>
-            </wp14:sizeRelV>
           </wp:anchor>
         </w:drawing>
       </w:r>
+    </w:p>
+    <w:p>
+      <w:pPr>
+        <w:pStyle w:val="Cuerpo"/>
+      </w:pPr>
+    </w:p>
+    <w:p>
+      <w:pPr>
+        <w:pStyle w:val="Cuerpo"/>
+      </w:pPr>
       <w:r>
         <w:rPr>
           <w:noProof/>
         </w:rPr>
         <w:drawing>
-          <wp:anchor distT="0" distB="0" distL="114300" distR="114300" simplePos="0" relativeHeight="251669504" behindDoc="0" locked="0" layoutInCell="1" allowOverlap="1" wp14:anchorId="4EA13316" wp14:editId="667F8E89">
+          <wp:anchor distT="0" distB="0" distL="114300" distR="114300" simplePos="0" relativeHeight="251669504" behindDoc="0" locked="0" layoutInCell="1" allowOverlap="1" wp14:anchorId="4EA13316" wp14:editId="3B7B47B9">
             <wp:simplePos x="0" y="0"/>
             <wp:positionH relativeFrom="margin">
               <wp:align>center</wp:align>
             </wp:positionH>
             <wp:positionV relativeFrom="paragraph">
-              <wp:posOffset>617016</wp:posOffset>
+              <wp:posOffset>123825</wp:posOffset>
             </wp:positionV>
             <wp:extent cx="4383405" cy="344805"/>
             <wp:effectExtent l="0" t="0" r="0" b="0"/>
@@ -1620,16 +2648,66 @@
       <w:pPr>
         <w:pStyle w:val="Cuerpo"/>
       </w:pPr>
-    </w:p>
-    <w:p>
-      <w:pPr>
-        <w:pStyle w:val="Cuerpo"/>
-      </w:pPr>
-    </w:p>
-    <w:p>
-      <w:pPr>
-        <w:pStyle w:val="Cuerpo"/>
-      </w:pPr>
+      <w:r>
+        <w:rPr>
+          <w:noProof/>
+        </w:rPr>
+        <w:drawing>
+          <wp:anchor distT="0" distB="0" distL="114300" distR="114300" simplePos="0" relativeHeight="251671552" behindDoc="0" locked="0" layoutInCell="1" allowOverlap="1" wp14:anchorId="3230B4A2" wp14:editId="34C75A19">
+            <wp:simplePos x="0" y="0"/>
+            <wp:positionH relativeFrom="margin">
+              <wp:align>center</wp:align>
+            </wp:positionH>
+            <wp:positionV relativeFrom="paragraph">
+              <wp:posOffset>10795</wp:posOffset>
+            </wp:positionV>
+            <wp:extent cx="1906270" cy="1636395"/>
+            <wp:effectExtent l="0" t="0" r="0" b="1905"/>
+            <wp:wrapSquare wrapText="bothSides"/>
+            <wp:docPr id="1249952040" name="Imagen 1"/>
+            <wp:cNvGraphicFramePr>
+              <a:graphicFrameLocks xmlns:a="http://schemas.openxmlformats.org/drawingml/2006/main" noChangeAspect="1"/>
+            </wp:cNvGraphicFramePr>
+            <a:graphic xmlns:a="http://schemas.openxmlformats.org/drawingml/2006/main">
+              <a:graphicData uri="http://schemas.openxmlformats.org/drawingml/2006/picture">
+                <pic:pic xmlns:pic="http://schemas.openxmlformats.org/drawingml/2006/picture">
+                  <pic:nvPicPr>
+                    <pic:cNvPr id="1249952040" name=""/>
+                    <pic:cNvPicPr/>
+                  </pic:nvPicPr>
+                  <pic:blipFill>
+                    <a:blip r:embed="rId21">
+                      <a:extLst>
+                        <a:ext uri="{28A0092B-C50C-407E-A947-70E740481C1C}">
+                          <a14:useLocalDpi xmlns:a14="http://schemas.microsoft.com/office/drawing/2010/main" val="0"/>
+                        </a:ext>
+                      </a:extLst>
+                    </a:blip>
+                    <a:stretch>
+                      <a:fillRect/>
+                    </a:stretch>
+                  </pic:blipFill>
+                  <pic:spPr>
+                    <a:xfrm>
+                      <a:off x="0" y="0"/>
+                      <a:ext cx="1906270" cy="1636395"/>
+                    </a:xfrm>
+                    <a:prstGeom prst="rect">
+                      <a:avLst/>
+                    </a:prstGeom>
+                  </pic:spPr>
+                </pic:pic>
+              </a:graphicData>
+            </a:graphic>
+            <wp14:sizeRelH relativeFrom="margin">
+              <wp14:pctWidth>0</wp14:pctWidth>
+            </wp14:sizeRelH>
+            <wp14:sizeRelV relativeFrom="margin">
+              <wp14:pctHeight>0</wp14:pctHeight>
+            </wp14:sizeRelV>
+          </wp:anchor>
+        </w:drawing>
+      </w:r>
     </w:p>
     <w:p>
       <w:pPr>
@@ -1677,10 +2755,12 @@
       <w:pPr>
         <w:pStyle w:val="Ttulos"/>
       </w:pPr>
+      <w:bookmarkStart w:id="10" w:name="_Toc191916021"/>
       <w:r>
         <w:lastRenderedPageBreak/>
         <w:t>Elementos de navegación</w:t>
       </w:r>
+      <w:bookmarkEnd w:id="10"/>
     </w:p>
     <w:p>
       <w:pPr>
@@ -1732,19 +2812,6 @@
     <w:p>
       <w:pPr>
         <w:pStyle w:val="Cuerpo"/>
-        <w:numPr>
-          <w:ilvl w:val="0"/>
-          <w:numId w:val="1"/>
-        </w:numPr>
-        <w:spacing w:after="0"/>
-      </w:pPr>
-      <w:r>
-        <w:t>Espaciado</w:t>
-      </w:r>
-    </w:p>
-    <w:p>
-      <w:pPr>
-        <w:pStyle w:val="Cuerpo"/>
       </w:pPr>
     </w:p>
     <w:p>
@@ -1756,12 +2823,14 @@
       <w:pPr>
         <w:pStyle w:val="Subttulos"/>
       </w:pPr>
+      <w:bookmarkStart w:id="11" w:name="_Toc191916022"/>
       <w:r>
         <w:t>Formulario</w:t>
       </w:r>
       <w:r>
         <w:t>s</w:t>
       </w:r>
+      <w:bookmarkEnd w:id="11"/>
     </w:p>
     <w:p>
       <w:pPr>
@@ -1837,7 +2906,13 @@
         <w:t>FORM</w:t>
       </w:r>
       <w:r>
-        <w:t xml:space="preserve"> clase: “row justify-content-center mt-4”</w:t>
+        <w:t xml:space="preserve"> clase: “</w:t>
+      </w:r>
+      <w:r>
+        <w:t>w-75 mt-4</w:t>
+      </w:r>
+      <w:r>
+        <w:t>”</w:t>
       </w:r>
     </w:p>
     <w:p>
@@ -1861,7 +2936,7 @@
         <w:t>“</w:t>
       </w:r>
       <w:r>
-        <w:t>col-12 col-md-6 mb-3</w:t>
+        <w:t>mb-3</w:t>
       </w:r>
       <w:r>
         <w:t>”</w:t>
@@ -1928,15 +3003,14 @@
     <w:p>
       <w:pPr>
         <w:pStyle w:val="Cuerpo"/>
+      </w:pPr>
+      <w:r>
         <w:rPr>
           <w:lang w:val="en-US"/>
         </w:rPr>
-      </w:pPr>
-      <w:r>
-        <w:rPr>
-          <w:lang w:val="en-US"/>
-        </w:rPr>
         <w:tab/>
+      </w:r>
+      <w:r>
         <w:t>…</w:t>
       </w:r>
     </w:p>
@@ -1945,9 +3019,6 @@
         <w:pStyle w:val="Cuerpo"/>
       </w:pPr>
       <w:r>
-        <w:rPr>
-          <w:lang w:val="en-US"/>
-        </w:rPr>
         <w:tab/>
       </w:r>
       <w:r>
@@ -1958,7 +3029,7 @@
         <w:t>DIV</w:t>
       </w:r>
       <w:r>
-        <w:t xml:space="preserve"> clase: “col-12 text-center”</w:t>
+        <w:t xml:space="preserve"> clase: “text-center”</w:t>
       </w:r>
     </w:p>
     <w:p>
@@ -2001,17 +3072,110 @@
           <w:szCs w:val="24"/>
         </w:rPr>
       </w:pPr>
+      <w:bookmarkStart w:id="12" w:name="_Toc191916023"/>
       <w:r>
         <w:t>Botones</w:t>
       </w:r>
-    </w:p>
-    <w:p>
-      <w:pPr>
-        <w:pStyle w:val="Cuerpo"/>
-      </w:pPr>
-      <w:r>
-        <w:t xml:space="preserve">Los botones en la página son enlaces (&lt;a&gt;&lt;/a&gt;) y buttons (&lt;button&gt;&lt;/button&gt;), pero lo que les da el estilo son las clases “btn” y “btn-primary”. El </w:t>
-      </w:r>
+      <w:bookmarkEnd w:id="12"/>
+    </w:p>
+    <w:p>
+      <w:pPr>
+        <w:pStyle w:val="Cuerpo"/>
+      </w:pPr>
+      <w:r>
+        <w:t xml:space="preserve">Los botones en la página son enlaces (&lt;a&gt;&lt;/a&gt;) y buttons (&lt;button&gt;&lt;/button&gt;), </w:t>
+      </w:r>
+      <w:r>
+        <w:t>y</w:t>
+      </w:r>
+      <w:r>
+        <w:t xml:space="preserve"> lo que les da el estilo son las clases “btn” y “btn-primary”. </w:t>
+      </w:r>
+      <w:r>
+        <w:t>Nótese que la clase “btn-primary” está modificada para poder encajar con nuestras preferencias creativas.</w:t>
+      </w:r>
+    </w:p>
+    <w:p>
+      <w:pPr>
+        <w:pStyle w:val="Cuerpo"/>
+      </w:pPr>
+    </w:p>
+    <w:p>
+      <w:pPr>
+        <w:pStyle w:val="Cuerpo"/>
+      </w:pPr>
+    </w:p>
+    <w:p>
+      <w:pPr>
+        <w:pStyle w:val="Subttulos"/>
+      </w:pPr>
+      <w:bookmarkStart w:id="13" w:name="_Toc191916024"/>
+      <w:r>
+        <w:lastRenderedPageBreak/>
+        <w:t>Imágenes</w:t>
+      </w:r>
+      <w:bookmarkEnd w:id="13"/>
+    </w:p>
+    <w:p>
+      <w:pPr>
+        <w:pStyle w:val="Cuerpo"/>
+      </w:pPr>
+      <w:r>
+        <w:t>Las imágenes del sitio deben estar en formato WebP y no deberán pesar más de 70KB, a fin de optimizar la carga del sitio y mejorar el SEO. Todas deben ir acompañadas del alt, que será siempre descriptivo del contenido de las imágenes (no del nombre de las mismas). Además, las imágenes deberán ir acompañadas de las clases “</w:t>
+      </w:r>
+      <w:r>
+        <w:t>img-fluid b-1</w:t>
+      </w:r>
+      <w:r>
+        <w:t>”, para hacerlas responsivas y mantener el borde redondeado característico.</w:t>
+      </w:r>
+    </w:p>
+    <w:p>
+      <w:pPr>
+        <w:pStyle w:val="Cuerpo"/>
+      </w:pPr>
+      <w:r>
+        <w:drawing>
+          <wp:inline distT="0" distB="0" distL="0" distR="0" wp14:anchorId="60C1737E" wp14:editId="6DDC7EF9">
+            <wp:extent cx="5400040" cy="2721610"/>
+            <wp:effectExtent l="0" t="0" r="0" b="2540"/>
+            <wp:docPr id="808835594" name="Imagen 1"/>
+            <wp:cNvGraphicFramePr>
+              <a:graphicFrameLocks xmlns:a="http://schemas.openxmlformats.org/drawingml/2006/main" noChangeAspect="1"/>
+            </wp:cNvGraphicFramePr>
+            <a:graphic xmlns:a="http://schemas.openxmlformats.org/drawingml/2006/main">
+              <a:graphicData uri="http://schemas.openxmlformats.org/drawingml/2006/picture">
+                <pic:pic xmlns:pic="http://schemas.openxmlformats.org/drawingml/2006/picture">
+                  <pic:nvPicPr>
+                    <pic:cNvPr id="808835594" name=""/>
+                    <pic:cNvPicPr/>
+                  </pic:nvPicPr>
+                  <pic:blipFill>
+                    <a:blip r:embed="rId22"/>
+                    <a:stretch>
+                      <a:fillRect/>
+                    </a:stretch>
+                  </pic:blipFill>
+                  <pic:spPr>
+                    <a:xfrm>
+                      <a:off x="0" y="0"/>
+                      <a:ext cx="5400040" cy="2721610"/>
+                    </a:xfrm>
+                    <a:prstGeom prst="rect">
+                      <a:avLst/>
+                    </a:prstGeom>
+                  </pic:spPr>
+                </pic:pic>
+              </a:graphicData>
+            </a:graphic>
+          </wp:inline>
+        </w:drawing>
+      </w:r>
+    </w:p>
+    <w:p>
+      <w:pPr>
+        <w:pStyle w:val="Cuerpo"/>
+      </w:pPr>
     </w:p>
     <w:sectPr>
       <w:pgSz w:w="11906" w:h="16838"/>
@@ -2747,7 +3911,6 @@
   <w:style w:type="character" w:default="1" w:styleId="Fuentedeprrafopredeter">
     <w:name w:val="Default Paragraph Font"/>
     <w:uiPriority w:val="1"/>
-    <w:semiHidden/>
     <w:unhideWhenUsed/>
   </w:style>
   <w:style w:type="table" w:default="1" w:styleId="Tablanormal">
@@ -3066,7 +4229,7 @@
     <w:basedOn w:val="Normal"/>
     <w:link w:val="TtulosCar"/>
     <w:qFormat/>
-    <w:rsid w:val="00111CC7"/>
+    <w:rsid w:val="009F5F26"/>
     <w:rPr>
       <w:rFonts w:ascii="TT Chocolates Trl" w:hAnsi="TT Chocolates Trl"/>
       <w:color w:val="184B2C"/>
@@ -3078,7 +4241,7 @@
     <w:name w:val="Títulos Car"/>
     <w:basedOn w:val="Fuentedeprrafopredeter"/>
     <w:link w:val="Ttulos"/>
-    <w:rsid w:val="00111CC7"/>
+    <w:rsid w:val="009F5F26"/>
     <w:rPr>
       <w:rFonts w:ascii="TT Chocolates Trl" w:hAnsi="TT Chocolates Trl"/>
       <w:color w:val="184B2C"/>
@@ -3136,6 +4299,95 @@
       <w:color w:val="184B2C"/>
       <w:sz w:val="52"/>
       <w:szCs w:val="52"/>
+    </w:rPr>
+  </w:style>
+  <w:style w:type="paragraph" w:styleId="TtuloTDC">
+    <w:name w:val="TOC Heading"/>
+    <w:basedOn w:val="Ttulo1"/>
+    <w:next w:val="Normal"/>
+    <w:uiPriority w:val="39"/>
+    <w:unhideWhenUsed/>
+    <w:qFormat/>
+    <w:rsid w:val="008630CC"/>
+    <w:pPr>
+      <w:spacing w:before="240" w:after="0"/>
+      <w:outlineLvl w:val="9"/>
+    </w:pPr>
+    <w:rPr>
+      <w:kern w:val="0"/>
+      <w:sz w:val="32"/>
+      <w:szCs w:val="32"/>
+      <w:lang w:eastAsia="es-ES"/>
+      <w14:ligatures w14:val="none"/>
+    </w:rPr>
+  </w:style>
+  <w:style w:type="paragraph" w:styleId="TDC2">
+    <w:name w:val="toc 2"/>
+    <w:basedOn w:val="Normal"/>
+    <w:next w:val="Normal"/>
+    <w:autoRedefine/>
+    <w:uiPriority w:val="39"/>
+    <w:unhideWhenUsed/>
+    <w:rsid w:val="009F5F26"/>
+    <w:pPr>
+      <w:spacing w:after="100"/>
+      <w:ind w:left="220"/>
+    </w:pPr>
+    <w:rPr>
+      <w:rFonts w:ascii="TT Chocolates Trl" w:eastAsiaTheme="minorEastAsia" w:hAnsi="TT Chocolates Trl" w:cs="Times New Roman"/>
+      <w:kern w:val="0"/>
+      <w:sz w:val="28"/>
+      <w:lang w:eastAsia="es-ES"/>
+      <w14:ligatures w14:val="none"/>
+    </w:rPr>
+  </w:style>
+  <w:style w:type="paragraph" w:styleId="TDC1">
+    <w:name w:val="toc 1"/>
+    <w:basedOn w:val="Normal"/>
+    <w:next w:val="Normal"/>
+    <w:autoRedefine/>
+    <w:uiPriority w:val="39"/>
+    <w:unhideWhenUsed/>
+    <w:rsid w:val="009F5F26"/>
+    <w:pPr>
+      <w:spacing w:after="100"/>
+    </w:pPr>
+    <w:rPr>
+      <w:rFonts w:ascii="TT Chocolates Trl" w:eastAsiaTheme="minorEastAsia" w:hAnsi="TT Chocolates Trl" w:cs="Times New Roman"/>
+      <w:kern w:val="0"/>
+      <w:sz w:val="36"/>
+      <w:lang w:eastAsia="es-ES"/>
+      <w14:ligatures w14:val="none"/>
+    </w:rPr>
+  </w:style>
+  <w:style w:type="paragraph" w:styleId="TDC3">
+    <w:name w:val="toc 3"/>
+    <w:basedOn w:val="Normal"/>
+    <w:next w:val="Normal"/>
+    <w:autoRedefine/>
+    <w:uiPriority w:val="39"/>
+    <w:unhideWhenUsed/>
+    <w:rsid w:val="008630CC"/>
+    <w:pPr>
+      <w:spacing w:after="100"/>
+      <w:ind w:left="440"/>
+    </w:pPr>
+    <w:rPr>
+      <w:rFonts w:eastAsiaTheme="minorEastAsia" w:cs="Times New Roman"/>
+      <w:kern w:val="0"/>
+      <w:lang w:eastAsia="es-ES"/>
+      <w14:ligatures w14:val="none"/>
+    </w:rPr>
+  </w:style>
+  <w:style w:type="character" w:styleId="Hipervnculo">
+    <w:name w:val="Hyperlink"/>
+    <w:basedOn w:val="Fuentedeprrafopredeter"/>
+    <w:uiPriority w:val="99"/>
+    <w:unhideWhenUsed/>
+    <w:rsid w:val="009F5F26"/>
+    <w:rPr>
+      <w:color w:val="0563C1" w:themeColor="hyperlink"/>
+      <w:u w:val="single"/>
     </w:rPr>
   </w:style>
 </w:styles>
@@ -3434,4 +4686,16 @@
     </a:ext>
   </a:extLst>
 </a:theme>
+</file>
+
+<file path=customXml/item1.xml><?xml version="1.0" encoding="utf-8"?>
+<b:Sources xmlns:b="http://schemas.openxmlformats.org/officeDocument/2006/bibliography" xmlns="http://schemas.openxmlformats.org/officeDocument/2006/bibliography" SelectedStyle="\APASixthEditionOfficeOnline.xsl" StyleName="APA" Version="6"/>
+</file>
+
+<file path=customXml/itemProps1.xml><?xml version="1.0" encoding="utf-8"?>
+<ds:datastoreItem xmlns:ds="http://schemas.openxmlformats.org/officeDocument/2006/customXml" ds:itemID="{B890A7AF-FADF-4285-A5DC-C8C146F49C43}">
+  <ds:schemaRefs>
+    <ds:schemaRef ds:uri="http://schemas.openxmlformats.org/officeDocument/2006/bibliography"/>
+  </ds:schemaRefs>
+</ds:datastoreItem>
 </file>
</xml_diff>

<commit_message>
Fix typos in authentication views, update form classes for consistency, and enhance product gallery layout
</commit_message>
<xml_diff>
--- a/Guía de estilo.docx
+++ b/Guía de estilo.docx
@@ -1470,18 +1470,28 @@
         <w:pStyle w:val="Subttulos"/>
       </w:pPr>
       <w:bookmarkStart w:id="1" w:name="_Toc191916012"/>
+      <w:proofErr w:type="spellStart"/>
       <w:r>
         <w:lastRenderedPageBreak/>
         <w:t>Header</w:t>
       </w:r>
       <w:bookmarkEnd w:id="1"/>
-    </w:p>
-    <w:p>
-      <w:pPr>
-        <w:pStyle w:val="Cuerpo"/>
-      </w:pPr>
-      <w:r>
-        <w:t>Los colores empleados en el header se funden para crear este degradado, posibilitando la buena visibilidad del logotipo y sus colores, así como de los enlaces y sus variaciones de color al pasar el ratón sobre ellos (como podemos apreciar en “iniciar sesión”).</w:t>
+      <w:proofErr w:type="spellEnd"/>
+    </w:p>
+    <w:p>
+      <w:pPr>
+        <w:pStyle w:val="Cuerpo"/>
+      </w:pPr>
+      <w:r>
+        <w:t xml:space="preserve">Los colores empleados en el </w:t>
+      </w:r>
+      <w:proofErr w:type="spellStart"/>
+      <w:r>
+        <w:t>header</w:t>
+      </w:r>
+      <w:proofErr w:type="spellEnd"/>
+      <w:r>
+        <w:t xml:space="preserve"> se funden para crear este degradado, posibilitando la buena visibilidad del logotipo y sus colores, así como de los enlaces y sus variaciones de color al pasar el ratón sobre ellos (como podemos apreciar en “iniciar sesión”).</w:t>
       </w:r>
     </w:p>
     <w:p>
@@ -1534,7 +1544,23 @@
         <w:pStyle w:val="Cuerpo"/>
       </w:pPr>
       <w:r>
-        <w:t>El uso del color principal en el header nos habla de la entidad de la marca, ya que el header es la primera parte de la página, y va a estar presente en ella durante toda la visita del usuario.</w:t>
+        <w:t xml:space="preserve">El uso del color principal en el </w:t>
+      </w:r>
+      <w:proofErr w:type="spellStart"/>
+      <w:r>
+        <w:t>header</w:t>
+      </w:r>
+      <w:proofErr w:type="spellEnd"/>
+      <w:r>
+        <w:t xml:space="preserve"> nos habla de la entidad de la marca, ya que el </w:t>
+      </w:r>
+      <w:proofErr w:type="spellStart"/>
+      <w:r>
+        <w:t>header</w:t>
+      </w:r>
+      <w:proofErr w:type="spellEnd"/>
+      <w:r>
+        <w:t xml:space="preserve"> es la primera parte de la página, y va a estar presente en ella durante toda la visita del usuario.</w:t>
       </w:r>
     </w:p>
     <w:p>
@@ -1665,6 +1691,9 @@
         <w:pStyle w:val="Cuerpo"/>
       </w:pPr>
       <w:r>
+        <w:rPr>
+          <w:noProof/>
+        </w:rPr>
         <w:drawing>
           <wp:anchor distT="0" distB="0" distL="114300" distR="114300" simplePos="0" relativeHeight="251674624" behindDoc="0" locked="0" layoutInCell="1" allowOverlap="1" wp14:anchorId="0B91EBCD" wp14:editId="085611B8">
             <wp:simplePos x="0" y="0"/>
@@ -1722,14 +1751,25 @@
         </w:drawing>
       </w:r>
       <w:r>
-        <w:t>Los botones tienen dos colores: el principal (#669966) y el de hover (#2C6E2C). Con esta mezcla se alerta al usuario de que está pasando el ratón por encima del botón, además del uso de la animación.</w:t>
-      </w:r>
-    </w:p>
-    <w:p>
-      <w:pPr>
-        <w:pStyle w:val="Cuerpo"/>
-      </w:pPr>
-      <w:r>
+        <w:t xml:space="preserve">Los botones tienen dos colores: el principal (#669966) y el de </w:t>
+      </w:r>
+      <w:proofErr w:type="spellStart"/>
+      <w:r>
+        <w:t>hover</w:t>
+      </w:r>
+      <w:proofErr w:type="spellEnd"/>
+      <w:r>
+        <w:t xml:space="preserve"> (#2C6E2C). Con esta mezcla se alerta al usuario de que está pasando el ratón por encima del botón, además del uso de la animación.</w:t>
+      </w:r>
+    </w:p>
+    <w:p>
+      <w:pPr>
+        <w:pStyle w:val="Cuerpo"/>
+      </w:pPr>
+      <w:r>
+        <w:rPr>
+          <w:noProof/>
+        </w:rPr>
         <w:drawing>
           <wp:anchor distT="0" distB="0" distL="114300" distR="114300" simplePos="0" relativeHeight="251673600" behindDoc="0" locked="0" layoutInCell="1" allowOverlap="1" wp14:anchorId="137DC744" wp14:editId="0B78390B">
             <wp:simplePos x="0" y="0"/>
@@ -1874,7 +1914,15 @@
         <w:pStyle w:val="Cuerpo"/>
       </w:pPr>
       <w:r>
-        <w:t>Además es el mismo color que se usa para los títulos del footer, para resaltarlos más.</w:t>
+        <w:t xml:space="preserve">Además es el mismo color que se usa para los títulos del </w:t>
+      </w:r>
+      <w:proofErr w:type="spellStart"/>
+      <w:r>
+        <w:t>footer</w:t>
+      </w:r>
+      <w:proofErr w:type="spellEnd"/>
+      <w:r>
+        <w:t>, para resaltarlos más.</w:t>
       </w:r>
     </w:p>
     <w:p>
@@ -1946,16 +1994,21 @@
         <w:pStyle w:val="Subttulos"/>
       </w:pPr>
       <w:bookmarkStart w:id="5" w:name="_Toc191916016"/>
+      <w:proofErr w:type="spellStart"/>
       <w:r>
         <w:t>Footer</w:t>
       </w:r>
       <w:bookmarkEnd w:id="5"/>
-    </w:p>
-    <w:p>
-      <w:pPr>
-        <w:pStyle w:val="Cuerpo"/>
-      </w:pPr>
-      <w:r>
+      <w:proofErr w:type="spellEnd"/>
+    </w:p>
+    <w:p>
+      <w:pPr>
+        <w:pStyle w:val="Cuerpo"/>
+      </w:pPr>
+      <w:r>
+        <w:rPr>
+          <w:noProof/>
+        </w:rPr>
         <w:drawing>
           <wp:anchor distT="0" distB="0" distL="114300" distR="114300" simplePos="0" relativeHeight="251672576" behindDoc="0" locked="0" layoutInCell="1" allowOverlap="1" wp14:anchorId="4E1F39EA" wp14:editId="279E72CC">
             <wp:simplePos x="0" y="0"/>
@@ -2007,7 +2060,15 @@
         </w:drawing>
       </w:r>
       <w:r>
-        <w:t>El color de fondo del footer es un tono similar al color principal (#669966), pero algo más oscuro; esta elección se debe a la necesidad de establecer un buen cierre para la página, para darle el sentido de “peso” que tienen las partes inferiores. Es sutil pero se nota.</w:t>
+        <w:t xml:space="preserve">El color de fondo del </w:t>
+      </w:r>
+      <w:proofErr w:type="spellStart"/>
+      <w:r>
+        <w:t>footer</w:t>
+      </w:r>
+      <w:proofErr w:type="spellEnd"/>
+      <w:r>
+        <w:t xml:space="preserve"> es un tono similar al color principal (#669966), pero algo más oscuro; esta elección se debe a la necesidad de establecer un buen cierre para la página, para darle el sentido de “peso” que tienen las partes inferiores. Es sutil pero se nota.</w:t>
       </w:r>
     </w:p>
     <w:p>
@@ -2050,6 +2111,7 @@
       <w:r>
         <w:t xml:space="preserve">La elección de las tipografías tiene dos objetivos: dar una entidad a la marca (queremos que se perciba como una empresa joven, alegre, </w:t>
       </w:r>
+      <w:proofErr w:type="spellStart"/>
       <w:r>
         <w:rPr>
           <w:i/>
@@ -2071,6 +2133,7 @@
         </w:rPr>
         <w:t>l</w:t>
       </w:r>
+      <w:proofErr w:type="spellEnd"/>
       <w:r>
         <w:t>, pero a la vez elegante y abierta a todo tipo de público) y facilitar a los usuarios la lectura y la navegación por la página.</w:t>
       </w:r>
@@ -2080,6 +2143,9 @@
         <w:pStyle w:val="Cuerpo"/>
       </w:pPr>
       <w:r>
+        <w:rPr>
+          <w:noProof/>
+        </w:rPr>
         <w:drawing>
           <wp:anchor distT="0" distB="0" distL="114300" distR="114300" simplePos="0" relativeHeight="251677696" behindDoc="0" locked="0" layoutInCell="1" allowOverlap="1" wp14:anchorId="7A1329F6" wp14:editId="33F98CFA">
             <wp:simplePos x="0" y="0"/>
@@ -2137,6 +2203,9 @@
         </w:drawing>
       </w:r>
       <w:r>
+        <w:rPr>
+          <w:noProof/>
+        </w:rPr>
         <w:drawing>
           <wp:anchor distT="0" distB="0" distL="114300" distR="114300" simplePos="0" relativeHeight="251675648" behindDoc="0" locked="0" layoutInCell="1" allowOverlap="1" wp14:anchorId="4948961C" wp14:editId="77F77FF3">
             <wp:simplePos x="0" y="0"/>
@@ -2260,10 +2329,39 @@
         <w:t xml:space="preserve"> tres</w:t>
       </w:r>
       <w:r>
-        <w:t xml:space="preserve"> tipografías principales: una con serifa y otra sin serifa. Las elegidas son </w:t>
-      </w:r>
-      <w:r>
-        <w:t>Fanlste para títulos, TT Chocolates para textos y Apollo para enlaces.</w:t>
+        <w:t xml:space="preserve"> tipografías principales: una con </w:t>
+      </w:r>
+      <w:proofErr w:type="spellStart"/>
+      <w:r>
+        <w:t>serifa</w:t>
+      </w:r>
+      <w:proofErr w:type="spellEnd"/>
+      <w:r>
+        <w:t xml:space="preserve"> y otra sin </w:t>
+      </w:r>
+      <w:proofErr w:type="spellStart"/>
+      <w:r>
+        <w:t>serifa</w:t>
+      </w:r>
+      <w:proofErr w:type="spellEnd"/>
+      <w:r>
+        <w:t xml:space="preserve">. Las elegidas son </w:t>
+      </w:r>
+      <w:proofErr w:type="spellStart"/>
+      <w:r>
+        <w:t>Fanlste</w:t>
+      </w:r>
+      <w:proofErr w:type="spellEnd"/>
+      <w:r>
+        <w:t xml:space="preserve"> para títulos, TT Chocolates para textos y </w:t>
+      </w:r>
+      <w:proofErr w:type="spellStart"/>
+      <w:r>
+        <w:t>Apollo</w:t>
+      </w:r>
+      <w:proofErr w:type="spellEnd"/>
+      <w:r>
+        <w:t xml:space="preserve"> para enlaces.</w:t>
       </w:r>
     </w:p>
     <w:p>
@@ -2271,18 +2369,28 @@
         <w:pStyle w:val="Subttulos"/>
       </w:pPr>
       <w:bookmarkStart w:id="7" w:name="_Toc191916018"/>
+      <w:proofErr w:type="spellStart"/>
       <w:r>
         <w:lastRenderedPageBreak/>
         <w:t>Fanlste</w:t>
       </w:r>
       <w:bookmarkEnd w:id="7"/>
-    </w:p>
-    <w:p>
-      <w:pPr>
-        <w:pStyle w:val="Cuerpo"/>
-      </w:pPr>
-      <w:r>
-        <w:t>Esta tipografía con serifa tiene un encanto único: tiene un grosor variable, siendo más fina en las curvas y más gruesa en las partes rectas. Tiene un carácter elegante, clásico y fresco a la vez. La hemos seleccionado por su buena legibilidad, además de por las modificaciones con diferentes caracteres especiales (empleados en la página web), para darle un toque diferente y especial. La hemos utilizado para los títulos, encontrándola en los H1 y los H3.</w:t>
+      <w:proofErr w:type="spellEnd"/>
+    </w:p>
+    <w:p>
+      <w:pPr>
+        <w:pStyle w:val="Cuerpo"/>
+      </w:pPr>
+      <w:r>
+        <w:t xml:space="preserve">Esta tipografía con </w:t>
+      </w:r>
+      <w:proofErr w:type="spellStart"/>
+      <w:r>
+        <w:t>serifa</w:t>
+      </w:r>
+      <w:proofErr w:type="spellEnd"/>
+      <w:r>
+        <w:t xml:space="preserve"> tiene un encanto único: tiene un grosor variable, siendo más fina en las curvas y más gruesa en las partes rectas. Tiene un carácter elegante, clásico y fresco a la vez. La hemos seleccionado por su buena legibilidad, además de por las modificaciones con diferentes caracteres especiales (empleados en la página web), para darle un toque diferente y especial. La hemos utilizado para los títulos, encontrándola en los H1 y los H3.</w:t>
       </w:r>
     </w:p>
     <w:p>
@@ -2378,7 +2486,23 @@
         <w:pStyle w:val="Cuerpo"/>
       </w:pPr>
       <w:r>
-        <w:t>Esta tipografía es una fuente de palo seco (sans), y es la elegida para los textos P. Es una fuente limpia y clara, que encaja bastante bien con la Fanlste porque también tiene un estilo redondeado, pero destaca por la pequeña variación que existe en la altura X (es la altura de las letras que no tienen ascendente ni descendente), lo que la hace resultar algo juguetona. Concretamente se ha usado la variante Light, aunque a veces se le añade las etiquetas correspondientes para mostrarla en itálica (&lt;i&gt;&lt;/i&gt;) o en negrita (&lt;b&gt;&lt;/b&gt;).</w:t>
+        <w:t>Esta tipografía es una fuente de palo seco (</w:t>
+      </w:r>
+      <w:proofErr w:type="spellStart"/>
+      <w:r>
+        <w:t>sans</w:t>
+      </w:r>
+      <w:proofErr w:type="spellEnd"/>
+      <w:r>
+        <w:t xml:space="preserve">), y es la elegida para los textos P. Es una fuente limpia y clara, que encaja bastante bien con la </w:t>
+      </w:r>
+      <w:proofErr w:type="spellStart"/>
+      <w:r>
+        <w:t>Fanlste</w:t>
+      </w:r>
+      <w:proofErr w:type="spellEnd"/>
+      <w:r>
+        <w:t xml:space="preserve"> porque también tiene un estilo redondeado, pero destaca por la pequeña variación que existe en la altura X (es la altura de las letras que no tienen ascendente ni descendente), lo que la hace resultar algo juguetona. Concretamente se ha usado la variante Light, aunque a veces se le añade las etiquetas correspondientes para mostrarla en itálica (&lt;i&gt;&lt;/i&gt;) o en negrita (&lt;b&gt;&lt;/b&gt;).</w:t>
       </w:r>
     </w:p>
     <w:p>
@@ -2473,47 +2597,100 @@
         <w:pStyle w:val="Subttulos"/>
       </w:pPr>
       <w:bookmarkStart w:id="9" w:name="_Toc191916020"/>
+      <w:proofErr w:type="spellStart"/>
       <w:r>
         <w:lastRenderedPageBreak/>
         <w:t>Apollo</w:t>
       </w:r>
       <w:bookmarkEnd w:id="9"/>
-    </w:p>
-    <w:p>
-      <w:pPr>
-        <w:pStyle w:val="Cuerpo"/>
-      </w:pPr>
-      <w:r>
-        <w:t>Esta es una fuente sans, al igual que la tipografía anterior, y es la aplicada a los enlaces (&lt;a&gt;&lt;/a&gt;). La hemos elegido porque hemos pensado que era el punto intermedio perfecto entre la Fanlste y la Chocolates: es redondeada y presenta variación en el grosor dependiendo de las curvas y las rectas, pero tiene una altura X igual, lo que la hace más madura.</w:t>
-      </w:r>
-    </w:p>
-    <w:p>
-      <w:pPr>
-        <w:pStyle w:val="Cuerpo"/>
-      </w:pPr>
-      <w:r>
-        <w:t>El color empleado es el color texto (#184B2C) cuando aparece en el header, como un enlace, o cuando aparece sobre fondos oscuros; también se utiliza el blanco para cuando aparece sobre fondos oscuros o como botón. Sin embargo, en ambas ocasiones, al pasar el ratón por encima (hover) aparece con el color verde claro (#B4E7AA).</w:t>
-      </w:r>
-    </w:p>
-    <w:p>
-      <w:pPr>
-        <w:pStyle w:val="Cuerpo"/>
-      </w:pPr>
-      <w:r>
-        <w:t xml:space="preserve">El tamaño con el que se muestra es el que trae por defecto; la única variación es que suele aparecer en mayúscula tanto en botones como en el header, mostrándose </w:t>
+      <w:proofErr w:type="spellEnd"/>
+    </w:p>
+    <w:p>
+      <w:pPr>
+        <w:pStyle w:val="Cuerpo"/>
+      </w:pPr>
+      <w:r>
+        <w:t xml:space="preserve">Esta es una fuente </w:t>
+      </w:r>
+      <w:proofErr w:type="spellStart"/>
+      <w:r>
+        <w:t>sans</w:t>
+      </w:r>
+      <w:proofErr w:type="spellEnd"/>
+      <w:r>
+        <w:t xml:space="preserve">, al igual que la tipografía anterior, y es la aplicada a los enlaces (&lt;a&gt;&lt;/a&gt;). La hemos elegido porque hemos pensado que era el punto intermedio perfecto entre la </w:t>
+      </w:r>
+      <w:proofErr w:type="spellStart"/>
+      <w:r>
+        <w:t>Fanlste</w:t>
+      </w:r>
+      <w:proofErr w:type="spellEnd"/>
+      <w:r>
+        <w:t xml:space="preserve"> y la Chocolates: es redondeada y presenta variación en el grosor dependiendo de las curvas y las rectas, pero tiene una altura X igual, lo que la hace más madura.</w:t>
+      </w:r>
+    </w:p>
+    <w:p>
+      <w:pPr>
+        <w:pStyle w:val="Cuerpo"/>
+      </w:pPr>
+      <w:r>
+        <w:t xml:space="preserve">El color empleado es el color texto (#184B2C) cuando aparece en el </w:t>
+      </w:r>
+      <w:proofErr w:type="spellStart"/>
+      <w:r>
+        <w:t>header</w:t>
+      </w:r>
+      <w:proofErr w:type="spellEnd"/>
+      <w:r>
+        <w:t>, como un enlace, o cuando aparece sobre fondos oscuros; también se utiliza el blanco para cuando aparece sobre fondos oscuros o como botón. Sin embargo, en ambas ocasiones, al pasar el ratón por encima (</w:t>
+      </w:r>
+      <w:proofErr w:type="spellStart"/>
+      <w:r>
+        <w:t>hover</w:t>
+      </w:r>
+      <w:proofErr w:type="spellEnd"/>
+      <w:r>
+        <w:t>) aparece con el color verde claro (#B4E7AA).</w:t>
+      </w:r>
+    </w:p>
+    <w:p>
+      <w:pPr>
+        <w:pStyle w:val="Cuerpo"/>
+      </w:pPr>
+      <w:r>
+        <w:t xml:space="preserve">El tamaño con el que se muestra es el que trae por defecto; la única variación es que suele aparecer en mayúscula tanto en botones como en el </w:t>
+      </w:r>
+      <w:proofErr w:type="spellStart"/>
+      <w:r>
+        <w:t>header</w:t>
+      </w:r>
+      <w:proofErr w:type="spellEnd"/>
+      <w:r>
+        <w:t xml:space="preserve">, mostrándose </w:t>
       </w:r>
       <w:r>
         <w:t xml:space="preserve">con minúsculas </w:t>
       </w:r>
       <w:r>
-        <w:t>únicamente en el footer.</w:t>
-      </w:r>
-    </w:p>
-    <w:p>
-      <w:pPr>
-        <w:pStyle w:val="Cuerpo"/>
-      </w:pPr>
-      <w:r>
+        <w:t xml:space="preserve">únicamente en el </w:t>
+      </w:r>
+      <w:proofErr w:type="spellStart"/>
+      <w:r>
+        <w:t>footer</w:t>
+      </w:r>
+      <w:proofErr w:type="spellEnd"/>
+      <w:r>
+        <w:t>.</w:t>
+      </w:r>
+    </w:p>
+    <w:p>
+      <w:pPr>
+        <w:pStyle w:val="Cuerpo"/>
+      </w:pPr>
+      <w:r>
+        <w:rPr>
+          <w:noProof/>
+        </w:rPr>
         <w:drawing>
           <wp:anchor distT="0" distB="0" distL="114300" distR="114300" simplePos="0" relativeHeight="251676672" behindDoc="0" locked="0" layoutInCell="1" allowOverlap="1" wp14:anchorId="676EA6D4" wp14:editId="262E0075">
             <wp:simplePos x="0" y="0"/>
@@ -2861,7 +3038,15 @@
         <w:t xml:space="preserve"> </w:t>
       </w:r>
       <w:r>
-        <w:t>clase: “text-center”</w:t>
+        <w:t>clase: “</w:t>
+      </w:r>
+      <w:proofErr w:type="spellStart"/>
+      <w:r>
+        <w:t>text</w:t>
+      </w:r>
+      <w:proofErr w:type="spellEnd"/>
+      <w:r>
+        <w:t>-center”</w:t>
       </w:r>
       <w:r>
         <w:t>→</w:t>
@@ -2885,6 +3070,9 @@
         <w:t xml:space="preserve"> </w:t>
       </w:r>
       <w:r>
+        <w:t>clase: “mt-2”</w:t>
+      </w:r>
+      <w:r>
         <w:t>→</w:t>
       </w:r>
       <w:r>
@@ -2909,7 +3097,10 @@
         <w:t xml:space="preserve"> clase: “</w:t>
       </w:r>
       <w:r>
-        <w:t>w-75 mt-4</w:t>
+        <w:t>w-75 mt-</w:t>
+      </w:r>
+      <w:r>
+        <w:t>2</w:t>
       </w:r>
       <w:r>
         <w:t>”</w:t>
@@ -2963,7 +3154,21 @@
         <w:t xml:space="preserve"> </w:t>
       </w:r>
       <w:r>
-        <w:t>clase: “form-label”</w:t>
+        <w:t>clase: “</w:t>
+      </w:r>
+      <w:r>
+        <w:t>form</w:t>
+      </w:r>
+      <w:r>
+        <w:t>-</w:t>
+      </w:r>
+      <w:proofErr w:type="spellStart"/>
+      <w:r>
+        <w:t>label</w:t>
+      </w:r>
+      <w:proofErr w:type="spellEnd"/>
+      <w:r>
+        <w:t>”</w:t>
       </w:r>
       <w:r>
         <w:t>→</w:t>
@@ -2997,7 +3202,35 @@
         <w:rPr>
           <w:lang w:val="en-US"/>
         </w:rPr>
-        <w:t xml:space="preserve"> clase: “form-control” (incluye placeholder y required)</w:t>
+        <w:t xml:space="preserve"> </w:t>
+      </w:r>
+      <w:proofErr w:type="spellStart"/>
+      <w:r>
+        <w:rPr>
+          <w:lang w:val="en-US"/>
+        </w:rPr>
+        <w:t>clase</w:t>
+      </w:r>
+      <w:proofErr w:type="spellEnd"/>
+      <w:r>
+        <w:rPr>
+          <w:lang w:val="en-US"/>
+        </w:rPr>
+        <w:t>: “form-control” (</w:t>
+      </w:r>
+      <w:proofErr w:type="spellStart"/>
+      <w:r>
+        <w:rPr>
+          <w:lang w:val="en-US"/>
+        </w:rPr>
+        <w:t>incluye</w:t>
+      </w:r>
+      <w:proofErr w:type="spellEnd"/>
+      <w:r>
+        <w:rPr>
+          <w:lang w:val="en-US"/>
+        </w:rPr>
+        <w:t xml:space="preserve"> placeholder y required)</w:t>
       </w:r>
     </w:p>
     <w:p>
@@ -3029,7 +3262,15 @@
         <w:t>DIV</w:t>
       </w:r>
       <w:r>
-        <w:t xml:space="preserve"> clase: “text-center”</w:t>
+        <w:t xml:space="preserve"> clase: “</w:t>
+      </w:r>
+      <w:proofErr w:type="spellStart"/>
+      <w:r>
+        <w:t>text</w:t>
+      </w:r>
+      <w:proofErr w:type="spellEnd"/>
+      <w:r>
+        <w:t>-center”</w:t>
       </w:r>
     </w:p>
     <w:p>
@@ -3053,7 +3294,31 @@
         <w:t xml:space="preserve"> </w:t>
       </w:r>
       <w:r>
-        <w:t>clase: “btn btn-primary”</w:t>
+        <w:t>clase: “</w:t>
+      </w:r>
+      <w:proofErr w:type="spellStart"/>
+      <w:r>
+        <w:t>btn</w:t>
+      </w:r>
+      <w:proofErr w:type="spellEnd"/>
+      <w:r>
+        <w:t xml:space="preserve"> </w:t>
+      </w:r>
+      <w:proofErr w:type="spellStart"/>
+      <w:r>
+        <w:t>btn-primary</w:t>
+      </w:r>
+      <w:proofErr w:type="spellEnd"/>
+      <w:r>
+        <w:t xml:space="preserve"> </w:t>
+      </w:r>
+      <w:proofErr w:type="spellStart"/>
+      <w:r>
+        <w:t>grow</w:t>
+      </w:r>
+      <w:proofErr w:type="spellEnd"/>
+      <w:r>
+        <w:t>”</w:t>
       </w:r>
       <w:r>
         <w:t>→</w:t>
@@ -3083,16 +3348,84 @@
         <w:pStyle w:val="Cuerpo"/>
       </w:pPr>
       <w:r>
-        <w:t xml:space="preserve">Los botones en la página son enlaces (&lt;a&gt;&lt;/a&gt;) y buttons (&lt;button&gt;&lt;/button&gt;), </w:t>
+        <w:t xml:space="preserve">Los botones en la página son enlaces (&lt;a&gt;&lt;/a&gt;) y </w:t>
+      </w:r>
+      <w:proofErr w:type="spellStart"/>
+      <w:r>
+        <w:t>buttons</w:t>
+      </w:r>
+      <w:proofErr w:type="spellEnd"/>
+      <w:r>
+        <w:t xml:space="preserve"> (&lt;</w:t>
+      </w:r>
+      <w:proofErr w:type="spellStart"/>
+      <w:r>
+        <w:t>button</w:t>
+      </w:r>
+      <w:proofErr w:type="spellEnd"/>
+      <w:r>
+        <w:t>&gt;&lt;/</w:t>
+      </w:r>
+      <w:proofErr w:type="spellStart"/>
+      <w:r>
+        <w:t>button</w:t>
+      </w:r>
+      <w:proofErr w:type="spellEnd"/>
+      <w:r>
+        <w:t xml:space="preserve">&gt;), </w:t>
       </w:r>
       <w:r>
         <w:t>y</w:t>
       </w:r>
       <w:r>
-        <w:t xml:space="preserve"> lo que les da el estilo son las clases “btn” y “btn-primary”. </w:t>
-      </w:r>
-      <w:r>
-        <w:t>Nótese que la clase “btn-primary” está modificada para poder encajar con nuestras preferencias creativas.</w:t>
+        <w:t xml:space="preserve"> lo que les da el estilo son las clases “</w:t>
+      </w:r>
+      <w:proofErr w:type="spellStart"/>
+      <w:r>
+        <w:t>btn</w:t>
+      </w:r>
+      <w:proofErr w:type="spellEnd"/>
+      <w:r>
+        <w:t>”</w:t>
+      </w:r>
+      <w:r>
+        <w:t>,</w:t>
+      </w:r>
+      <w:r>
+        <w:t xml:space="preserve"> “</w:t>
+      </w:r>
+      <w:proofErr w:type="spellStart"/>
+      <w:r>
+        <w:t>btn-primary</w:t>
+      </w:r>
+      <w:proofErr w:type="spellEnd"/>
+      <w:r>
+        <w:t>”</w:t>
+      </w:r>
+      <w:r>
+        <w:t xml:space="preserve"> y “</w:t>
+      </w:r>
+      <w:proofErr w:type="spellStart"/>
+      <w:r>
+        <w:t>grow</w:t>
+      </w:r>
+      <w:proofErr w:type="spellEnd"/>
+      <w:r>
+        <w:t>”</w:t>
+      </w:r>
+      <w:r>
+        <w:t xml:space="preserve">. </w:t>
+      </w:r>
+      <w:r>
+        <w:t>Nótese que la clase “</w:t>
+      </w:r>
+      <w:proofErr w:type="spellStart"/>
+      <w:r>
+        <w:t>btn-primary</w:t>
+      </w:r>
+      <w:proofErr w:type="spellEnd"/>
+      <w:r>
+        <w:t>” está modificada para poder encajar con nuestras preferencias creativas.</w:t>
       </w:r>
     </w:p>
     <w:p>
@@ -3121,7 +3454,23 @@
         <w:pStyle w:val="Cuerpo"/>
       </w:pPr>
       <w:r>
-        <w:t>Las imágenes del sitio deben estar en formato WebP y no deberán pesar más de 70KB, a fin de optimizar la carga del sitio y mejorar el SEO. Todas deben ir acompañadas del alt, que será siempre descriptivo del contenido de las imágenes (no del nombre de las mismas). Además, las imágenes deberán ir acompañadas de las clases “</w:t>
+        <w:t xml:space="preserve">Las imágenes del sitio deben estar en formato </w:t>
+      </w:r>
+      <w:proofErr w:type="spellStart"/>
+      <w:r>
+        <w:t>WebP</w:t>
+      </w:r>
+      <w:proofErr w:type="spellEnd"/>
+      <w:r>
+        <w:t xml:space="preserve"> y no deberán pesar más de 70KB, a fin de optimizar la carga del sitio y mejorar el SEO. Todas deben ir acompañadas del </w:t>
+      </w:r>
+      <w:proofErr w:type="spellStart"/>
+      <w:r>
+        <w:t>alt</w:t>
+      </w:r>
+      <w:proofErr w:type="spellEnd"/>
+      <w:r>
+        <w:t>, que será siempre descriptivo del contenido de las imágenes (no del nombre de las mismas). Además, las imágenes deberán ir acompañadas de las clases “</w:t>
       </w:r>
       <w:r>
         <w:t>img-fluid b-1</w:t>
@@ -3135,6 +3484,9 @@
         <w:pStyle w:val="Cuerpo"/>
       </w:pPr>
       <w:r>
+        <w:rPr>
+          <w:noProof/>
+        </w:rPr>
         <w:drawing>
           <wp:inline distT="0" distB="0" distL="0" distR="0" wp14:anchorId="60C1737E" wp14:editId="6DDC7EF9">
             <wp:extent cx="5400040" cy="2721610"/>
@@ -3911,6 +4263,7 @@
   <w:style w:type="character" w:default="1" w:styleId="Fuentedeprrafopredeter">
     <w:name w:val="Default Paragraph Font"/>
     <w:uiPriority w:val="1"/>
+    <w:semiHidden/>
     <w:unhideWhenUsed/>
   </w:style>
   <w:style w:type="table" w:default="1" w:styleId="Tablanormal">

</xml_diff>